<commit_message>
Add the UAT server prerequisites and CLI install to the Confluence page
The UAT server has no Salesforce CLI, which the migrated jobs need for
every query and bulk load. Adds a step covering the installer and npm
routes, the commands to verify the release is new enough, and the two
things that break a scheduled job: PATH scoped to the installing user
rather than the job account, and a job account with no loadable profile
for the CLI to persist its login into.

Splits Prerequisites into Salesforce and UAT server, and notes that the
migrated jobs no longer need Data Loader or Java.

Co-Authored-By: Claude Opus 5 <noreply@anthropic.com>
Claude-Session: https://claude.ai/code/session_01UofnxBGyfwDnAk9PthSpom
</commit_message>
<xml_diff>
--- a/Data-Loader-ECA-Migration.docx
+++ b/Data-Loader-ECA-Migration.docx
@@ -62,7 +62,11 @@
     </w:p>
     <w:p>
       <w:r>
-        <w:t xml:space="preserve">Before starting the authentication setup, ensure the following are completed in Salesforce:</w:t>
+        <w:rPr>
+          <w:b/>
+          <w:bCs/>
+        </w:rPr>
+        <w:t xml:space="preserve">In Salesforce</w:t>
       </w:r>
     </w:p>
     <w:p>
@@ -127,7 +131,11 @@
     </w:p>
     <w:p>
       <w:r>
-        <w:t xml:space="preserve">And on the batch server:</w:t>
+        <w:rPr>
+          <w:b/>
+          <w:bCs/>
+        </w:rPr>
+        <w:t xml:space="preserve">On the UAT server</w:t>
       </w:r>
     </w:p>
     <w:p>
@@ -139,7 +147,7 @@
         <w:ind w:left="720"/>
       </w:pPr>
       <w:r>
-        <w:t xml:space="preserve">The Salesforce CLI (sf) is installed and available on the system PATH.</w:t>
+        <w:t xml:space="preserve">The Salesforce CLI (sf) is installed and available on the system PATH. This is a new requirement and is covered in Step 1 of the next section.</w:t>
       </w:r>
     </w:p>
     <w:p>
@@ -151,7 +159,67 @@
         <w:ind w:left="720"/>
       </w:pPr>
       <w:r>
-        <w:t xml:space="preserve">curl.exe is present in System32. Windows 10 version 1803 and later ship it as standard.</w:t>
+        <w:t xml:space="preserve">curl.exe is present in System32. Windows 10 version 1803, Windows Server 2019 and later ship it as standard. On an older build it must be installed.</w:t>
+      </w:r>
+    </w:p>
+    <w:p>
+      <w:pPr>
+        <w:numPr>
+          <w:ilvl w:val="0"/>
+          <w:numId w:val="4"/>
+        </w:numPr>
+        <w:ind w:left="720"/>
+      </w:pPr>
+      <w:r>
+        <w:t xml:space="preserve">Windows PowerShell 5.1 is present in System32. It ships with Windows and is used for reading the bean file and preparing CSV files.</w:t>
+      </w:r>
+    </w:p>
+    <w:p>
+      <w:pPr>
+        <w:numPr>
+          <w:ilvl w:val="0"/>
+          <w:numId w:val="4"/>
+        </w:numPr>
+        <w:ind w:left="720"/>
+      </w:pPr>
+      <w:r>
+        <w:t xml:space="preserve">Outbound HTTPS on port 443 is open to the Salesforce org, and TLS 1.2 is enabled.</w:t>
+      </w:r>
+    </w:p>
+    <w:p>
+      <w:pPr>
+        <w:numPr>
+          <w:ilvl w:val="0"/>
+          <w:numId w:val="4"/>
+        </w:numPr>
+        <w:ind w:left="720"/>
+      </w:pPr>
+      <w:r>
+        <w:t xml:space="preserve">If the server reaches the internet through a corporate proxy, the proxy is configured for the account the scheduled jobs run as.</w:t>
+      </w:r>
+    </w:p>
+    <w:p>
+      <w:pPr>
+        <w:numPr>
+          <w:ilvl w:val="0"/>
+          <w:numId w:val="4"/>
+        </w:numPr>
+        <w:ind w:left="720"/>
+      </w:pPr>
+      <w:r>
+        <w:t xml:space="preserve">The account the scheduled tasks run as can read and write the NLG folder tree and has a loadable Windows user profile.</w:t>
+      </w:r>
+    </w:p>
+    <w:p>
+      <w:r>
+        <w:rPr>
+          <w:b/>
+          <w:bCs/>
+        </w:rPr>
+        <w:t xml:space="preserve">Note: </w:t>
+      </w:r>
+      <w:r>
+        <w:t xml:space="preserve">The migrated jobs no longer call the Data Loader process runner, so they no longer need the Data Loader installation or a Java runtime. Leave both in place if any job that has not yet been migrated still uses them.</w:t>
       </w:r>
     </w:p>
     <w:p/>
@@ -849,7 +917,591 @@
           <w:b/>
           <w:bCs/>
         </w:rPr>
-        <w:t xml:space="preserve">Step 1 - Create the credentials file</w:t>
+        <w:t xml:space="preserve">Step 1 - Install the Salesforce CLI on the UAT server</w:t>
+      </w:r>
+    </w:p>
+    <w:p>
+      <w:r>
+        <w:t xml:space="preserve">The jobs run their queries and bulk loads through the Salesforce CLI, so it must be installed on the server before anything else is tested. Install it once, for the whole machine, not for a single user profile.</w:t>
+      </w:r>
+    </w:p>
+    <w:p>
+      <w:r>
+        <w:rPr>
+          <w:b/>
+          <w:bCs/>
+        </w:rPr>
+        <w:t xml:space="preserve">Option A - Windows installer (recommended for a server)</w:t>
+      </w:r>
+    </w:p>
+    <w:p>
+      <w:r>
+        <w:t xml:space="preserve">Download the Windows installer from the Salesforce CLI download page and run it as an administrator. It bundles its own Node.js runtime, so nothing else has to be installed, and it adds the CLI to the system PATH:</w:t>
+      </w:r>
+    </w:p>
+    <w:p>
+      <w:r>
+        <w:rPr>
+          <w:rFonts w:ascii="Consolas" w:hAnsi="Consolas"/>
+        </w:rPr>
+        <w:t xml:space="preserve">https://developer.salesforce.com/tools/salesforcecli</w:t>
+      </w:r>
+    </w:p>
+    <w:p>
+      <w:r>
+        <w:t xml:space="preserve">The installer places the CLI in its own Program Files folder, for example:</w:t>
+      </w:r>
+    </w:p>
+    <w:p>
+      <w:r>
+        <w:rPr>
+          <w:rFonts w:ascii="Consolas" w:hAnsi="Consolas"/>
+        </w:rPr>
+        <w:t xml:space="preserve">C:\Program Files\sf\bin</w:t>
+      </w:r>
+    </w:p>
+    <w:p>
+      <w:r>
+        <w:rPr>
+          <w:b/>
+          <w:bCs/>
+        </w:rPr>
+        <w:t xml:space="preserve">Option B - npm</w:t>
+      </w:r>
+    </w:p>
+    <w:p>
+      <w:r>
+        <w:t xml:space="preserve">If Node.js is already managed on the server, the CLI can instead be installed with npm:</w:t>
+      </w:r>
+    </w:p>
+    <w:p>
+      <w:r>
+        <w:rPr>
+          <w:rFonts w:ascii="Consolas" w:hAnsi="Consolas"/>
+        </w:rPr>
+        <w:t xml:space="preserve">npm install --global @salesforce/cli</w:t>
+      </w:r>
+    </w:p>
+    <w:p>
+      <w:r>
+        <w:rPr>
+          <w:b/>
+          <w:bCs/>
+        </w:rPr>
+        <w:t xml:space="preserve">Note: </w:t>
+      </w:r>
+      <w:r>
+        <w:t xml:space="preserve">If the UAT server has no internet access, download the installer on a machine that does and copy it across. The CLI does not need internet access at run time. It only needs to reach the Salesforce org.</w:t>
+      </w:r>
+    </w:p>
+    <w:p/>
+    <w:p>
+      <w:r>
+        <w:rPr>
+          <w:b/>
+          <w:bCs/>
+        </w:rPr>
+        <w:t xml:space="preserve">Verify the installation</w:t>
+      </w:r>
+    </w:p>
+    <w:p>
+      <w:r>
+        <w:t xml:space="preserve">Open a new Command Prompt, so it picks up the updated PATH, and confirm the CLI responds:</w:t>
+      </w:r>
+    </w:p>
+    <w:p>
+      <w:r>
+        <w:rPr>
+          <w:rFonts w:ascii="Consolas" w:hAnsi="Consolas"/>
+        </w:rPr>
+        <w:t xml:space="preserve">sf --version</w:t>
+      </w:r>
+    </w:p>
+    <w:p>
+      <w:r>
+        <w:t xml:space="preserve">Then confirm the specific commands the jobs use are present in the installed release. Each of these should print help rather than an error:</w:t>
+      </w:r>
+    </w:p>
+    <w:tbl>
+      <w:tblPr>
+        <w:tblW w:w="0" w:type="auto"/>
+        <w:tblCellMar>
+          <w:left w:w="0" w:type="dxa"/>
+          <w:right w:w="0" w:type="dxa"/>
+        </w:tblCellMar>
+        <w:tblLook w:val="04A0" w:firstRow="1" w:lastRow="0" w:firstColumn="1" w:lastColumn="0" w:noHBand="0" w:noVBand="1"/>
+      </w:tblPr>
+      <w:tblGrid>
+        <w:gridCol w:w="3600"/>
+        <w:gridCol w:w="3600"/>
+      </w:tblGrid>
+      <w:tr>
+        <w:trPr>
+          <w:tblHeader/>
+        </w:trPr>
+        <w:tc>
+          <w:tcPr>
+            <w:tcW w:w="0" w:type="auto"/>
+            <w:tcBorders>
+              <w:top w:val="single" w:sz="6" w:space="0" w:color="auto"/>
+              <w:left w:val="single" w:sz="6" w:space="0" w:color="auto"/>
+              <w:bottom w:val="single" w:sz="6" w:space="0" w:color="auto"/>
+              <w:right w:val="single" w:sz="6" w:space="0" w:color="auto"/>
+            </w:tcBorders>
+            <w:tcMar>
+              <w:top w:w="105" w:type="dxa"/>
+              <w:left w:w="150" w:type="dxa"/>
+              <w:bottom w:w="105" w:type="dxa"/>
+              <w:right w:w="150" w:type="dxa"/>
+            </w:tcMar>
+          </w:tcPr>
+          <w:p>
+            <w:r>
+              <w:rPr>
+                <w:b/>
+                <w:bCs/>
+              </w:rPr>
+              <w:t xml:space="preserve">Command</w:t>
+            </w:r>
+          </w:p>
+        </w:tc>
+        <w:tc>
+          <w:tcPr>
+            <w:tcW w:w="0" w:type="auto"/>
+            <w:tcBorders>
+              <w:top w:val="single" w:sz="6" w:space="0" w:color="auto"/>
+              <w:left w:val="single" w:sz="6" w:space="0" w:color="auto"/>
+              <w:bottom w:val="single" w:sz="6" w:space="0" w:color="auto"/>
+              <w:right w:val="single" w:sz="6" w:space="0" w:color="auto"/>
+            </w:tcBorders>
+            <w:tcMar>
+              <w:top w:w="105" w:type="dxa"/>
+              <w:left w:w="150" w:type="dxa"/>
+              <w:bottom w:w="105" w:type="dxa"/>
+              <w:right w:w="150" w:type="dxa"/>
+            </w:tcMar>
+          </w:tcPr>
+          <w:p>
+            <w:r>
+              <w:rPr>
+                <w:b/>
+                <w:bCs/>
+              </w:rPr>
+              <w:t xml:space="preserve">Used for</w:t>
+            </w:r>
+          </w:p>
+        </w:tc>
+      </w:tr>
+      <w:tr>
+        <w:tc>
+          <w:tcPr>
+            <w:tcW w:w="0" w:type="auto"/>
+            <w:tcBorders>
+              <w:top w:val="single" w:sz="6" w:space="0" w:color="auto"/>
+              <w:left w:val="single" w:sz="6" w:space="0" w:color="auto"/>
+              <w:bottom w:val="single" w:sz="6" w:space="0" w:color="auto"/>
+              <w:right w:val="single" w:sz="6" w:space="0" w:color="auto"/>
+            </w:tcBorders>
+            <w:tcMar>
+              <w:top w:w="105" w:type="dxa"/>
+              <w:left w:w="150" w:type="dxa"/>
+              <w:bottom w:w="105" w:type="dxa"/>
+              <w:right w:w="150" w:type="dxa"/>
+            </w:tcMar>
+          </w:tcPr>
+          <w:p>
+            <w:r>
+              <w:rPr>
+                <w:rFonts w:ascii="Consolas" w:hAnsi="Consolas"/>
+              </w:rPr>
+              <w:t xml:space="preserve">sf org login access-token --help</w:t>
+            </w:r>
+          </w:p>
+        </w:tc>
+        <w:tc>
+          <w:tcPr>
+            <w:tcW w:w="0" w:type="auto"/>
+            <w:tcBorders>
+              <w:top w:val="single" w:sz="6" w:space="0" w:color="auto"/>
+              <w:left w:val="single" w:sz="6" w:space="0" w:color="auto"/>
+              <w:bottom w:val="single" w:sz="6" w:space="0" w:color="auto"/>
+              <w:right w:val="single" w:sz="6" w:space="0" w:color="auto"/>
+            </w:tcBorders>
+            <w:tcMar>
+              <w:top w:w="105" w:type="dxa"/>
+              <w:left w:w="150" w:type="dxa"/>
+              <w:bottom w:w="105" w:type="dxa"/>
+              <w:right w:w="150" w:type="dxa"/>
+            </w:tcMar>
+          </w:tcPr>
+          <w:p>
+            <w:r>
+              <w:t xml:space="preserve">Handing the OAuth token to the CLI</w:t>
+            </w:r>
+          </w:p>
+        </w:tc>
+      </w:tr>
+      <w:tr>
+        <w:tc>
+          <w:tcPr>
+            <w:tcW w:w="0" w:type="auto"/>
+            <w:tcBorders>
+              <w:top w:val="single" w:sz="6" w:space="0" w:color="auto"/>
+              <w:left w:val="single" w:sz="6" w:space="0" w:color="auto"/>
+              <w:bottom w:val="single" w:sz="6" w:space="0" w:color="auto"/>
+              <w:right w:val="single" w:sz="6" w:space="0" w:color="auto"/>
+            </w:tcBorders>
+            <w:tcMar>
+              <w:top w:w="105" w:type="dxa"/>
+              <w:left w:w="150" w:type="dxa"/>
+              <w:bottom w:w="105" w:type="dxa"/>
+              <w:right w:w="150" w:type="dxa"/>
+            </w:tcMar>
+          </w:tcPr>
+          <w:p>
+            <w:r>
+              <w:rPr>
+                <w:rFonts w:ascii="Consolas" w:hAnsi="Consolas"/>
+              </w:rPr>
+              <w:t xml:space="preserve">sf data query --help</w:t>
+            </w:r>
+          </w:p>
+        </w:tc>
+        <w:tc>
+          <w:tcPr>
+            <w:tcW w:w="0" w:type="auto"/>
+            <w:tcBorders>
+              <w:top w:val="single" w:sz="6" w:space="0" w:color="auto"/>
+              <w:left w:val="single" w:sz="6" w:space="0" w:color="auto"/>
+              <w:bottom w:val="single" w:sz="6" w:space="0" w:color="auto"/>
+              <w:right w:val="single" w:sz="6" w:space="0" w:color="auto"/>
+            </w:tcBorders>
+            <w:tcMar>
+              <w:top w:w="105" w:type="dxa"/>
+              <w:left w:w="150" w:type="dxa"/>
+              <w:bottom w:w="105" w:type="dxa"/>
+              <w:right w:w="150" w:type="dxa"/>
+            </w:tcMar>
+          </w:tcPr>
+          <w:p>
+            <w:r>
+              <w:t xml:space="preserve">The extract and backup jobs</w:t>
+            </w:r>
+          </w:p>
+        </w:tc>
+      </w:tr>
+      <w:tr>
+        <w:tc>
+          <w:tcPr>
+            <w:tcW w:w="0" w:type="auto"/>
+            <w:tcBorders>
+              <w:top w:val="single" w:sz="6" w:space="0" w:color="auto"/>
+              <w:left w:val="single" w:sz="6" w:space="0" w:color="auto"/>
+              <w:bottom w:val="single" w:sz="6" w:space="0" w:color="auto"/>
+              <w:right w:val="single" w:sz="6" w:space="0" w:color="auto"/>
+            </w:tcBorders>
+            <w:tcMar>
+              <w:top w:w="105" w:type="dxa"/>
+              <w:left w:w="150" w:type="dxa"/>
+              <w:bottom w:w="105" w:type="dxa"/>
+              <w:right w:w="150" w:type="dxa"/>
+            </w:tcMar>
+          </w:tcPr>
+          <w:p>
+            <w:r>
+              <w:rPr>
+                <w:rFonts w:ascii="Consolas" w:hAnsi="Consolas"/>
+              </w:rPr>
+              <w:t xml:space="preserve">sf data import bulk --help</w:t>
+            </w:r>
+          </w:p>
+        </w:tc>
+        <w:tc>
+          <w:tcPr>
+            <w:tcW w:w="0" w:type="auto"/>
+            <w:tcBorders>
+              <w:top w:val="single" w:sz="6" w:space="0" w:color="auto"/>
+              <w:left w:val="single" w:sz="6" w:space="0" w:color="auto"/>
+              <w:bottom w:val="single" w:sz="6" w:space="0" w:color="auto"/>
+              <w:right w:val="single" w:sz="6" w:space="0" w:color="auto"/>
+            </w:tcBorders>
+            <w:tcMar>
+              <w:top w:w="105" w:type="dxa"/>
+              <w:left w:w="150" w:type="dxa"/>
+              <w:bottom w:w="105" w:type="dxa"/>
+              <w:right w:w="150" w:type="dxa"/>
+            </w:tcMar>
+          </w:tcPr>
+          <w:p>
+            <w:r>
+              <w:t xml:space="preserve">Insert jobs</w:t>
+            </w:r>
+          </w:p>
+        </w:tc>
+      </w:tr>
+      <w:tr>
+        <w:tc>
+          <w:tcPr>
+            <w:tcW w:w="0" w:type="auto"/>
+            <w:tcBorders>
+              <w:top w:val="single" w:sz="6" w:space="0" w:color="auto"/>
+              <w:left w:val="single" w:sz="6" w:space="0" w:color="auto"/>
+              <w:bottom w:val="single" w:sz="6" w:space="0" w:color="auto"/>
+              <w:right w:val="single" w:sz="6" w:space="0" w:color="auto"/>
+            </w:tcBorders>
+            <w:tcMar>
+              <w:top w:w="105" w:type="dxa"/>
+              <w:left w:w="150" w:type="dxa"/>
+              <w:bottom w:w="105" w:type="dxa"/>
+              <w:right w:w="150" w:type="dxa"/>
+            </w:tcMar>
+          </w:tcPr>
+          <w:p>
+            <w:r>
+              <w:rPr>
+                <w:rFonts w:ascii="Consolas" w:hAnsi="Consolas"/>
+              </w:rPr>
+              <w:t xml:space="preserve">sf data update bulk --help</w:t>
+            </w:r>
+          </w:p>
+        </w:tc>
+        <w:tc>
+          <w:tcPr>
+            <w:tcW w:w="0" w:type="auto"/>
+            <w:tcBorders>
+              <w:top w:val="single" w:sz="6" w:space="0" w:color="auto"/>
+              <w:left w:val="single" w:sz="6" w:space="0" w:color="auto"/>
+              <w:bottom w:val="single" w:sz="6" w:space="0" w:color="auto"/>
+              <w:right w:val="single" w:sz="6" w:space="0" w:color="auto"/>
+            </w:tcBorders>
+            <w:tcMar>
+              <w:top w:w="105" w:type="dxa"/>
+              <w:left w:w="150" w:type="dxa"/>
+              <w:bottom w:w="105" w:type="dxa"/>
+              <w:right w:w="150" w:type="dxa"/>
+            </w:tcMar>
+          </w:tcPr>
+          <w:p>
+            <w:r>
+              <w:t xml:space="preserve">Update jobs</w:t>
+            </w:r>
+          </w:p>
+        </w:tc>
+      </w:tr>
+      <w:tr>
+        <w:tc>
+          <w:tcPr>
+            <w:tcW w:w="0" w:type="auto"/>
+            <w:tcBorders>
+              <w:top w:val="single" w:sz="6" w:space="0" w:color="auto"/>
+              <w:left w:val="single" w:sz="6" w:space="0" w:color="auto"/>
+              <w:bottom w:val="single" w:sz="6" w:space="0" w:color="auto"/>
+              <w:right w:val="single" w:sz="6" w:space="0" w:color="auto"/>
+            </w:tcBorders>
+            <w:tcMar>
+              <w:top w:w="105" w:type="dxa"/>
+              <w:left w:w="150" w:type="dxa"/>
+              <w:bottom w:w="105" w:type="dxa"/>
+              <w:right w:w="150" w:type="dxa"/>
+            </w:tcMar>
+          </w:tcPr>
+          <w:p>
+            <w:r>
+              <w:rPr>
+                <w:rFonts w:ascii="Consolas" w:hAnsi="Consolas"/>
+              </w:rPr>
+              <w:t xml:space="preserve">sf data upsert bulk --help</w:t>
+            </w:r>
+          </w:p>
+        </w:tc>
+        <w:tc>
+          <w:tcPr>
+            <w:tcW w:w="0" w:type="auto"/>
+            <w:tcBorders>
+              <w:top w:val="single" w:sz="6" w:space="0" w:color="auto"/>
+              <w:left w:val="single" w:sz="6" w:space="0" w:color="auto"/>
+              <w:bottom w:val="single" w:sz="6" w:space="0" w:color="auto"/>
+              <w:right w:val="single" w:sz="6" w:space="0" w:color="auto"/>
+            </w:tcBorders>
+            <w:tcMar>
+              <w:top w:w="105" w:type="dxa"/>
+              <w:left w:w="150" w:type="dxa"/>
+              <w:bottom w:w="105" w:type="dxa"/>
+              <w:right w:w="150" w:type="dxa"/>
+            </w:tcMar>
+          </w:tcPr>
+          <w:p>
+            <w:r>
+              <w:t xml:space="preserve">Upsert jobs</w:t>
+            </w:r>
+          </w:p>
+        </w:tc>
+      </w:tr>
+      <w:tr>
+        <w:tc>
+          <w:tcPr>
+            <w:tcW w:w="0" w:type="auto"/>
+            <w:tcBorders>
+              <w:top w:val="single" w:sz="6" w:space="0" w:color="auto"/>
+              <w:left w:val="single" w:sz="6" w:space="0" w:color="auto"/>
+              <w:bottom w:val="single" w:sz="6" w:space="0" w:color="auto"/>
+              <w:right w:val="single" w:sz="6" w:space="0" w:color="auto"/>
+            </w:tcBorders>
+            <w:tcMar>
+              <w:top w:w="105" w:type="dxa"/>
+              <w:left w:w="150" w:type="dxa"/>
+              <w:bottom w:w="105" w:type="dxa"/>
+              <w:right w:w="150" w:type="dxa"/>
+            </w:tcMar>
+          </w:tcPr>
+          <w:p>
+            <w:r>
+              <w:rPr>
+                <w:rFonts w:ascii="Consolas" w:hAnsi="Consolas"/>
+              </w:rPr>
+              <w:t xml:space="preserve">sf data delete bulk --help</w:t>
+            </w:r>
+          </w:p>
+        </w:tc>
+        <w:tc>
+          <w:tcPr>
+            <w:tcW w:w="0" w:type="auto"/>
+            <w:tcBorders>
+              <w:top w:val="single" w:sz="6" w:space="0" w:color="auto"/>
+              <w:left w:val="single" w:sz="6" w:space="0" w:color="auto"/>
+              <w:bottom w:val="single" w:sz="6" w:space="0" w:color="auto"/>
+              <w:right w:val="single" w:sz="6" w:space="0" w:color="auto"/>
+            </w:tcBorders>
+            <w:tcMar>
+              <w:top w:w="105" w:type="dxa"/>
+              <w:left w:w="150" w:type="dxa"/>
+              <w:bottom w:w="105" w:type="dxa"/>
+              <w:right w:w="150" w:type="dxa"/>
+            </w:tcMar>
+          </w:tcPr>
+          <w:p>
+            <w:r>
+              <w:t xml:space="preserve">Delete jobs</w:t>
+            </w:r>
+          </w:p>
+        </w:tc>
+      </w:tr>
+      <w:tr>
+        <w:tc>
+          <w:tcPr>
+            <w:tcW w:w="0" w:type="auto"/>
+            <w:tcBorders>
+              <w:top w:val="single" w:sz="6" w:space="0" w:color="auto"/>
+              <w:left w:val="single" w:sz="6" w:space="0" w:color="auto"/>
+              <w:bottom w:val="single" w:sz="6" w:space="0" w:color="auto"/>
+              <w:right w:val="single" w:sz="6" w:space="0" w:color="auto"/>
+            </w:tcBorders>
+            <w:tcMar>
+              <w:top w:w="105" w:type="dxa"/>
+              <w:left w:w="150" w:type="dxa"/>
+              <w:bottom w:w="105" w:type="dxa"/>
+              <w:right w:w="150" w:type="dxa"/>
+            </w:tcMar>
+          </w:tcPr>
+          <w:p>
+            <w:r>
+              <w:rPr>
+                <w:rFonts w:ascii="Consolas" w:hAnsi="Consolas"/>
+              </w:rPr>
+              <w:t xml:space="preserve">sf data bulk results --help</w:t>
+            </w:r>
+          </w:p>
+        </w:tc>
+        <w:tc>
+          <w:tcPr>
+            <w:tcW w:w="0" w:type="auto"/>
+            <w:tcBorders>
+              <w:top w:val="single" w:sz="6" w:space="0" w:color="auto"/>
+              <w:left w:val="single" w:sz="6" w:space="0" w:color="auto"/>
+              <w:bottom w:val="single" w:sz="6" w:space="0" w:color="auto"/>
+              <w:right w:val="single" w:sz="6" w:space="0" w:color="auto"/>
+            </w:tcBorders>
+            <w:tcMar>
+              <w:top w:w="105" w:type="dxa"/>
+              <w:left w:w="150" w:type="dxa"/>
+              <w:bottom w:w="105" w:type="dxa"/>
+              <w:right w:w="150" w:type="dxa"/>
+            </w:tcMar>
+          </w:tcPr>
+          <w:p>
+            <w:r>
+              <w:t xml:space="preserve">Collecting the success and error files</w:t>
+            </w:r>
+          </w:p>
+        </w:tc>
+      </w:tr>
+    </w:tbl>
+    <w:p>
+      <w:r>
+        <w:rPr>
+          <w:b/>
+          <w:bCs/>
+        </w:rPr>
+        <w:t xml:space="preserve">Note: </w:t>
+      </w:r>
+      <w:r>
+        <w:t xml:space="preserve">The bulk data commands have been added to the CLI over several releases. If any of the above is not recognised, the installed CLI is too old. Upgrade it rather than working around it.</w:t>
+      </w:r>
+    </w:p>
+    <w:p/>
+    <w:p>
+      <w:r>
+        <w:rPr>
+          <w:b/>
+          <w:bCs/>
+        </w:rPr>
+        <w:t xml:space="preserve">Two things that catch a batch server out</w:t>
+      </w:r>
+    </w:p>
+    <w:p>
+      <w:pPr>
+        <w:numPr>
+          <w:ilvl w:val="0"/>
+          <w:numId w:val="4"/>
+        </w:numPr>
+        <w:ind w:left="720"/>
+      </w:pPr>
+      <w:r>
+        <w:t xml:space="preserve">PATH. The CLI must be on the PATH of the account the scheduled task runs as, not only the administrator who installed it. Installing while signed in as one user and running the job as a service account is the most common reason a job that works by hand fails when scheduled. Confirm it by running sf --version as that account.</w:t>
+      </w:r>
+    </w:p>
+    <w:p>
+      <w:pPr>
+        <w:numPr>
+          <w:ilvl w:val="0"/>
+          <w:numId w:val="4"/>
+        </w:numPr>
+        <w:ind w:left="720"/>
+      </w:pPr>
+      <w:r>
+        <w:t xml:space="preserve">User profile. The CLI stores the persisted login under the running account’s user profile. That account needs a real, loadable Windows profile with write access to it. A service account that has never signed in interactively may not have one.</w:t>
+      </w:r>
+    </w:p>
+    <w:p>
+      <w:r>
+        <w:rPr>
+          <w:b/>
+          <w:bCs/>
+        </w:rPr>
+        <w:t xml:space="preserve">Note: </w:t>
+      </w:r>
+      <w:r>
+        <w:t xml:space="preserve">If the server uses a proxy, set the proxy environment variables for the job account. Both the CLI and curl.exe read them, and without them the token request fails before it ever reaches Salesforce.</w:t>
+      </w:r>
+    </w:p>
+    <w:p/>
+    <w:p>
+      <w:r>
+        <w:rPr>
+          <w:b/>
+          <w:bCs/>
+        </w:rPr>
+        <w:t xml:space="preserve">Step 2 - Create the credentials file</w:t>
       </w:r>
     </w:p>
     <w:p>
@@ -1221,7 +1873,7 @@
           <w:b/>
           <w:bCs/>
         </w:rPr>
-        <w:t xml:space="preserve">Step 2 - Remove the old login entries from the bean file</w:t>
+        <w:t xml:space="preserve">Step 3 - Remove the old login entries from the bean file</w:t>
       </w:r>
     </w:p>
     <w:p>
@@ -1285,7 +1937,7 @@
           <w:b/>
           <w:bCs/>
         </w:rPr>
-        <w:t xml:space="preserve">Step 3 - How the authorization works</w:t>
+        <w:t xml:space="preserve">Step 4 - How the authorization works</w:t>
       </w:r>
     </w:p>
     <w:p>
@@ -1663,7 +2315,7 @@
           <w:b/>
           <w:bCs/>
         </w:rPr>
-        <w:t xml:space="preserve">Step 4 - Confirm the target org before running</w:t>
+        <w:t xml:space="preserve">Step 5 - Confirm the target org before running</w:t>
       </w:r>
     </w:p>
     <w:p>
@@ -2009,7 +2661,13 @@
         <w:ind w:left="720"/>
       </w:pPr>
       <w:r>
-        <w:t xml:space="preserve">The Salesforce CLI is installed and on the PATH of the account the scheduled task runs as.</w:t>
+        <w:t xml:space="preserve">The org alias in the credentials file matches the alias the run reports.</w:t>
+      </w:r>
+    </w:p>
+    <w:p/>
+    <w:p>
+      <w:r>
+        <w:t xml:space="preserve">If the CLI itself is the problem, verify:</w:t>
       </w:r>
     </w:p>
     <w:p>
@@ -2021,7 +2679,55 @@
         <w:ind w:left="720"/>
       </w:pPr>
       <w:r>
-        <w:t xml:space="preserve">The org alias in the credentials file matches the alias the run reports.</w:t>
+        <w:t xml:space="preserve">sf --version responds in a new Command Prompt.</w:t>
+      </w:r>
+    </w:p>
+    <w:p>
+      <w:pPr>
+        <w:numPr>
+          <w:ilvl w:val="0"/>
+          <w:numId w:val="4"/>
+        </w:numPr>
+        <w:ind w:left="720"/>
+      </w:pPr>
+      <w:r>
+        <w:t xml:space="preserve">It also responds when run as the account the scheduled task uses, not only as the administrator who installed it.</w:t>
+      </w:r>
+    </w:p>
+    <w:p>
+      <w:pPr>
+        <w:numPr>
+          <w:ilvl w:val="0"/>
+          <w:numId w:val="4"/>
+        </w:numPr>
+        <w:ind w:left="720"/>
+      </w:pPr>
+      <w:r>
+        <w:t xml:space="preserve">The installed release recognises every bulk data command the jobs use.</w:t>
+      </w:r>
+    </w:p>
+    <w:p>
+      <w:pPr>
+        <w:numPr>
+          <w:ilvl w:val="0"/>
+          <w:numId w:val="4"/>
+        </w:numPr>
+        <w:ind w:left="720"/>
+      </w:pPr>
+      <w:r>
+        <w:t xml:space="preserve">The job account has a loadable Windows profile the CLI can write its persisted login into.</w:t>
+      </w:r>
+    </w:p>
+    <w:p>
+      <w:pPr>
+        <w:numPr>
+          <w:ilvl w:val="0"/>
+          <w:numId w:val="4"/>
+        </w:numPr>
+        <w:ind w:left="720"/>
+      </w:pPr>
+      <w:r>
+        <w:t xml:space="preserve">Proxy environment variables are set for the job account, if the server uses a proxy.</w:t>
       </w:r>
     </w:p>
     <w:sectPr>

</xml_diff>

<commit_message>
Restructure the Confluence page around four goal-led parts
Rewrites the page so someone new to the setup can follow it. Opens with
the goal, then four parts: create the app in Salesforce, install the CLI
on the UAT server, create the credentials file, edit the bean and test.
Each part states its goal up front.

Troubleshooting becomes a symptom-to-cause table, including the two
failures that actually bite: a Command Prompt opened before the install,
and a scheduled task running as an account that cannot find the CLI.

Co-Authored-By: Claude Opus 5 <noreply@anthropic.com>
Claude-Session: https://claude.ai/code/session_01UofnxBGyfwDnAk9PthSpom
</commit_message>
<xml_diff>
--- a/Data-Loader-ECA-Migration.docx
+++ b/Data-Loader-ECA-Migration.docx
@@ -19,29 +19,29 @@
     </w:p>
     <w:p>
       <w:r>
-        <w:t xml:space="preserve">Salesforce is retiring username and password authentication for external integrations and is moving integrations off the legacy Connected App framework onto External Client Apps (ECA). An integration that signs in with a stored username and password will stop connecting once that change reaches the org.</w:t>
-      </w:r>
-    </w:p>
-    <w:p>
-      <w:r>
-        <w:t xml:space="preserve">A number of Salesforce Data Loader jobs run daily on the batch server. Each one authenticates today with an integration user’s username and an encrypted password held inside its own bean file. This document describes migrating those jobs from username and password authentication to External Client App authentication using the OAuth 2.0 Client Credentials flow.</w:t>
-      </w:r>
-    </w:p>
-    <w:p>
-      <w:r>
-        <w:rPr>
-          <w:b/>
-          <w:bCs/>
-        </w:rPr>
-        <w:t xml:space="preserve">Only the login method changes. </w:t>
-      </w:r>
-      <w:r>
-        <w:t xml:space="preserve">The bean files, batch files, SDL mapping files, folder structure, file paths and the daily schedule on the production server all stay exactly as they are. The only edit made to a bean file is the removal of the four entries that carried the old login. Nothing else in it is touched.</w:t>
-      </w:r>
-    </w:p>
-    <w:p>
-      <w:r>
-        <w:t xml:space="preserve">The change is being proved first in a local folder that mirrors the production tree, to confirm both that the External Client App login succeeds and that the bulk loads still run correctly through it.</w:t>
+        <w:t xml:space="preserve">Salesforce is retiring username and password login for integrations. Any job that still signs in that way will stop connecting. The replacement is an External Client App, which lets a program log in using an ID and a secret instead of a user’s password.</w:t>
+      </w:r>
+    </w:p>
+    <w:p>
+      <w:r>
+        <w:t xml:space="preserve">A number of Salesforce Data Loader jobs run daily on our batch server. Each one currently logs in with an integration user’s username and an encrypted password stored inside its own bean file. This document covers moving those jobs onto External Client App login.</w:t>
+      </w:r>
+    </w:p>
+    <w:p>
+      <w:r>
+        <w:rPr>
+          <w:b/>
+          <w:bCs/>
+        </w:rPr>
+        <w:t xml:space="preserve">Goal: change the login method and nothing else. </w:t>
+      </w:r>
+      <w:r>
+        <w:t xml:space="preserve">The bean files, batch files, SDL mapping files, folder structure, file paths and the daily schedule all stay exactly as they are. The only change inside a bean file is that four lines are removed.</w:t>
+      </w:r>
+    </w:p>
+    <w:p>
+      <w:r>
+        <w:t xml:space="preserve">This is being done in UAT first, in a folder that mirrors production, to prove the login works and the jobs still load data correctly before production is touched.</w:t>
       </w:r>
     </w:p>
     <w:p/>
@@ -57,320 +57,12 @@
           <w:b/>
           <w:bCs/>
         </w:rPr>
-        <w:t xml:space="preserve">Prerequisites</w:t>
-      </w:r>
-    </w:p>
-    <w:p>
-      <w:r>
-        <w:rPr>
-          <w:b/>
-          <w:bCs/>
-        </w:rPr>
-        <w:t xml:space="preserve">In Salesforce</w:t>
-      </w:r>
-    </w:p>
-    <w:p>
-      <w:pPr>
-        <w:numPr>
-          <w:ilvl w:val="0"/>
-          <w:numId w:val="4"/>
-        </w:numPr>
-        <w:ind w:left="720"/>
-      </w:pPr>
-      <w:r>
-        <w:t xml:space="preserve">External Client Apps are enabled in the Salesforce org.</w:t>
-      </w:r>
-    </w:p>
-    <w:p>
-      <w:pPr>
-        <w:numPr>
-          <w:ilvl w:val="0"/>
-          <w:numId w:val="4"/>
-        </w:numPr>
-        <w:ind w:left="720"/>
-      </w:pPr>
-      <w:r>
-        <w:t xml:space="preserve">An External Client App has been created for the Data Loader integration.</w:t>
-      </w:r>
-    </w:p>
-    <w:p>
-      <w:pPr>
-        <w:numPr>
-          <w:ilvl w:val="0"/>
-          <w:numId w:val="4"/>
-        </w:numPr>
-        <w:ind w:left="720"/>
-      </w:pPr>
-      <w:r>
-        <w:t xml:space="preserve">OAuth settings are enabled on that app.</w:t>
-      </w:r>
-    </w:p>
-    <w:p>
-      <w:pPr>
-        <w:numPr>
-          <w:ilvl w:val="0"/>
-          <w:numId w:val="4"/>
-        </w:numPr>
-        <w:ind w:left="720"/>
-      </w:pPr>
-      <w:r>
-        <w:t xml:space="preserve">The Client Credentials flow is enabled on that app and a Run As user is set.</w:t>
-      </w:r>
-    </w:p>
-    <w:p>
-      <w:pPr>
-        <w:numPr>
-          <w:ilvl w:val="0"/>
-          <w:numId w:val="4"/>
-        </w:numPr>
-        <w:ind w:left="720"/>
-      </w:pPr>
-      <w:r>
-        <w:t xml:space="preserve">The Run As user holds every permission the daily jobs need.</w:t>
-      </w:r>
-    </w:p>
-    <w:p>
-      <w:r>
-        <w:rPr>
-          <w:b/>
-          <w:bCs/>
-        </w:rPr>
-        <w:t xml:space="preserve">On the UAT server</w:t>
-      </w:r>
-    </w:p>
-    <w:p>
-      <w:pPr>
-        <w:numPr>
-          <w:ilvl w:val="0"/>
-          <w:numId w:val="4"/>
-        </w:numPr>
-        <w:ind w:left="720"/>
-      </w:pPr>
-      <w:r>
-        <w:t xml:space="preserve">The Salesforce CLI (sf) is installed and available on the system PATH. This is a new requirement and is covered in Step 1 of the next section.</w:t>
-      </w:r>
-    </w:p>
-    <w:p>
-      <w:pPr>
-        <w:numPr>
-          <w:ilvl w:val="0"/>
-          <w:numId w:val="4"/>
-        </w:numPr>
-        <w:ind w:left="720"/>
-      </w:pPr>
-      <w:r>
-        <w:t xml:space="preserve">curl.exe is present in System32. Windows 10 version 1803, Windows Server 2019 and later ship it as standard. On an older build it must be installed.</w:t>
-      </w:r>
-    </w:p>
-    <w:p>
-      <w:pPr>
-        <w:numPr>
-          <w:ilvl w:val="0"/>
-          <w:numId w:val="4"/>
-        </w:numPr>
-        <w:ind w:left="720"/>
-      </w:pPr>
-      <w:r>
-        <w:t xml:space="preserve">Windows PowerShell 5.1 is present in System32. It ships with Windows and is used for reading the bean file and preparing CSV files.</w:t>
-      </w:r>
-    </w:p>
-    <w:p>
-      <w:pPr>
-        <w:numPr>
-          <w:ilvl w:val="0"/>
-          <w:numId w:val="4"/>
-        </w:numPr>
-        <w:ind w:left="720"/>
-      </w:pPr>
-      <w:r>
-        <w:t xml:space="preserve">Outbound HTTPS on port 443 is open to the Salesforce org, and TLS 1.2 is enabled.</w:t>
-      </w:r>
-    </w:p>
-    <w:p>
-      <w:pPr>
-        <w:numPr>
-          <w:ilvl w:val="0"/>
-          <w:numId w:val="4"/>
-        </w:numPr>
-        <w:ind w:left="720"/>
-      </w:pPr>
-      <w:r>
-        <w:t xml:space="preserve">If the server reaches the internet through a corporate proxy, the proxy is configured for the account the scheduled jobs run as.</w:t>
-      </w:r>
-    </w:p>
-    <w:p>
-      <w:pPr>
-        <w:numPr>
-          <w:ilvl w:val="0"/>
-          <w:numId w:val="4"/>
-        </w:numPr>
-        <w:ind w:left="720"/>
-      </w:pPr>
-      <w:r>
-        <w:t xml:space="preserve">The account the scheduled tasks run as can read and write the NLG folder tree and has a loadable Windows user profile.</w:t>
-      </w:r>
-    </w:p>
-    <w:p>
-      <w:r>
-        <w:rPr>
-          <w:b/>
-          <w:bCs/>
-        </w:rPr>
-        <w:t xml:space="preserve">Note: </w:t>
-      </w:r>
-      <w:r>
-        <w:t xml:space="preserve">The migrated jobs no longer call the Data Loader process runner, so they no longer need the Data Loader installation or a Java runtime. Leave both in place if any job that has not yet been migrated still uses them.</w:t>
-      </w:r>
-    </w:p>
-    <w:p/>
-    <w:p>
-      <w:pPr>
-        <w:rPr>
-          <w:b/>
-          <w:bCs/>
-        </w:rPr>
-      </w:pPr>
-      <w:r>
-        <w:rPr>
-          <w:b/>
-          <w:bCs/>
-        </w:rPr>
-        <w:t xml:space="preserve">Salesforce Configuration Steps</w:t>
-      </w:r>
-    </w:p>
-    <w:p>
-      <w:r>
-        <w:rPr>
-          <w:b/>
-          <w:bCs/>
-        </w:rPr>
-        <w:t xml:space="preserve">Step 1 - Create the External Client App</w:t>
-      </w:r>
-    </w:p>
-    <w:p>
-      <w:r>
-        <w:t xml:space="preserve">Navigate to:</w:t>
-      </w:r>
-    </w:p>
-    <w:p>
-      <w:r>
-        <w:rPr>
-          <w:rFonts w:ascii="Consolas" w:hAnsi="Consolas"/>
-        </w:rPr>
-        <w:t xml:space="preserve">Setup → Apps → External Client Apps → External Client App Manager</w:t>
-      </w:r>
-    </w:p>
-    <w:p>
-      <w:r>
-        <w:t xml:space="preserve">Select New External Client App and give it a name that identifies it as the Data Loader batch integration.</w:t>
-      </w:r>
-    </w:p>
-    <w:p>
-      <w:r>
-        <w:rPr>
-          <w:b/>
-          <w:bCs/>
-        </w:rPr>
-        <w:t xml:space="preserve">[ Screenshot: External Client App Manager, new app ]</w:t>
-      </w:r>
-    </w:p>
-    <w:p/>
-    <w:p>
-      <w:r>
-        <w:rPr>
-          <w:b/>
-          <w:bCs/>
-        </w:rPr>
-        <w:t xml:space="preserve">Step 2 - Enable OAuth Settings</w:t>
-      </w:r>
-    </w:p>
-    <w:p>
-      <w:r>
-        <w:t xml:space="preserve">In the app, open the API (Enable OAuth Settings) section and enable OAuth.</w:t>
-      </w:r>
-    </w:p>
-    <w:p>
-      <w:pPr>
-        <w:numPr>
-          <w:ilvl w:val="0"/>
-          <w:numId w:val="4"/>
-        </w:numPr>
-        <w:ind w:left="720"/>
-      </w:pPr>
-      <w:r>
-        <w:t xml:space="preserve">A Callback URL is required by the form even though the Client Credentials flow never redirects a browser. Any valid HTTPS URL satisfies it.</w:t>
-      </w:r>
-    </w:p>
-    <w:p>
-      <w:pPr>
-        <w:numPr>
-          <w:ilvl w:val="0"/>
-          <w:numId w:val="4"/>
-        </w:numPr>
-        <w:ind w:left="720"/>
-      </w:pPr>
-      <w:r>
-        <w:t xml:space="preserve">Grant the OAuth scope that allows managing user data via APIs. This is the scope the Data Loader jobs need in order to query, insert, update, upsert and delete records.</w:t>
-      </w:r>
-    </w:p>
-    <w:p>
-      <w:r>
-        <w:rPr>
-          <w:b/>
-          <w:bCs/>
-        </w:rPr>
-        <w:t xml:space="preserve">[ Screenshot: OAuth settings and scopes ]</w:t>
-      </w:r>
-    </w:p>
-    <w:p/>
-    <w:p>
-      <w:r>
-        <w:rPr>
-          <w:b/>
-          <w:bCs/>
-        </w:rPr>
-        <w:t xml:space="preserve">Step 3 - Enable the Client Credentials Flow and set the Run As user</w:t>
-      </w:r>
-    </w:p>
-    <w:p>
-      <w:r>
-        <w:t xml:space="preserve">In the app’s policies, enable the Client Credentials flow and set the Run As user.</w:t>
-      </w:r>
-    </w:p>
-    <w:p>
-      <w:r>
-        <w:rPr>
-          <w:b/>
-          <w:bCs/>
-        </w:rPr>
-        <w:t xml:space="preserve">Note: </w:t>
-      </w:r>
-      <w:r>
-        <w:t xml:space="preserve">The Client Credentials flow has no interactive user. Every record the daily jobs read, write or delete is processed as the Run As user, so that user’s profile and permission sets are the effective permissions for the whole integration. Grant it what the jobs need and no more.</w:t>
-      </w:r>
-    </w:p>
-    <w:p>
-      <w:r>
-        <w:rPr>
-          <w:b/>
-          <w:bCs/>
-        </w:rPr>
-        <w:t xml:space="preserve">[ Screenshot: Client Credentials flow enabled, Run As user set ]</w:t>
-      </w:r>
-    </w:p>
-    <w:p/>
-    <w:p>
-      <w:r>
-        <w:rPr>
-          <w:b/>
-          <w:bCs/>
-        </w:rPr>
-        <w:t xml:space="preserve">Step 4 - Retrieve the Consumer Key and Consumer Secret</w:t>
-      </w:r>
-    </w:p>
-    <w:p>
-      <w:r>
-        <w:t xml:space="preserve">Open the app’s OAuth settings and reveal the Consumer Key and Consumer Secret. These two values are what the batch server presents in place of a username and password:</w:t>
+        <w:t xml:space="preserve">Overview</w:t>
+      </w:r>
+    </w:p>
+    <w:p>
+      <w:r>
+        <w:t xml:space="preserve">Four parts, in this order.</w:t>
       </w:r>
     </w:p>
     <w:tbl>
@@ -383,8 +75,9 @@
         <w:tblLook w:val="04A0" w:firstRow="1" w:lastRow="0" w:firstColumn="1" w:lastColumn="0" w:noHBand="0" w:noVBand="1"/>
       </w:tblPr>
       <w:tblGrid>
-        <w:gridCol w:w="3200"/>
-        <w:gridCol w:w="3200"/>
+        <w:gridCol w:w="900"/>
+        <w:gridCol w:w="1600"/>
+        <w:gridCol w:w="4700"/>
       </w:tblGrid>
       <w:tr>
         <w:trPr>
@@ -412,7 +105,7 @@
                 <w:b/>
                 <w:bCs/>
               </w:rPr>
-              <w:t xml:space="preserve">Salesforce field</w:t>
+              <w:t xml:space="preserve">Part</w:t>
             </w:r>
           </w:p>
         </w:tc>
@@ -438,154 +131,10 @@
                 <w:b/>
                 <w:bCs/>
               </w:rPr>
-              <w:t xml:space="preserve">Used on the server as</w:t>
-            </w:r>
-          </w:p>
-        </w:tc>
-      </w:tr>
-      <w:tr>
-        <w:tc>
-          <w:tcPr>
-            <w:tcW w:w="0" w:type="auto"/>
-            <w:tcBorders>
-              <w:top w:val="single" w:sz="6" w:space="0" w:color="auto"/>
-              <w:left w:val="single" w:sz="6" w:space="0" w:color="auto"/>
-              <w:bottom w:val="single" w:sz="6" w:space="0" w:color="auto"/>
-              <w:right w:val="single" w:sz="6" w:space="0" w:color="auto"/>
-            </w:tcBorders>
-            <w:tcMar>
-              <w:top w:w="105" w:type="dxa"/>
-              <w:left w:w="150" w:type="dxa"/>
-              <w:bottom w:w="105" w:type="dxa"/>
-              <w:right w:w="150" w:type="dxa"/>
-            </w:tcMar>
-          </w:tcPr>
-          <w:p>
-            <w:r>
-              <w:t xml:space="preserve">Consumer Key</w:t>
-            </w:r>
-          </w:p>
-        </w:tc>
-        <w:tc>
-          <w:tcPr>
-            <w:tcW w:w="0" w:type="auto"/>
-            <w:tcBorders>
-              <w:top w:val="single" w:sz="6" w:space="0" w:color="auto"/>
-              <w:left w:val="single" w:sz="6" w:space="0" w:color="auto"/>
-              <w:bottom w:val="single" w:sz="6" w:space="0" w:color="auto"/>
-              <w:right w:val="single" w:sz="6" w:space="0" w:color="auto"/>
-            </w:tcBorders>
-            <w:tcMar>
-              <w:top w:w="105" w:type="dxa"/>
-              <w:left w:w="150" w:type="dxa"/>
-              <w:bottom w:w="105" w:type="dxa"/>
-              <w:right w:w="150" w:type="dxa"/>
-            </w:tcMar>
-          </w:tcPr>
-          <w:p>
-            <w:r>
-              <w:rPr>
-                <w:rFonts w:ascii="Consolas" w:hAnsi="Consolas"/>
-              </w:rPr>
-              <w:t xml:space="preserve">clientId</w:t>
-            </w:r>
-          </w:p>
-        </w:tc>
-      </w:tr>
-      <w:tr>
-        <w:tc>
-          <w:tcPr>
-            <w:tcW w:w="0" w:type="auto"/>
-            <w:tcBorders>
-              <w:top w:val="single" w:sz="6" w:space="0" w:color="auto"/>
-              <w:left w:val="single" w:sz="6" w:space="0" w:color="auto"/>
-              <w:bottom w:val="single" w:sz="6" w:space="0" w:color="auto"/>
-              <w:right w:val="single" w:sz="6" w:space="0" w:color="auto"/>
-            </w:tcBorders>
-            <w:tcMar>
-              <w:top w:w="105" w:type="dxa"/>
-              <w:left w:w="150" w:type="dxa"/>
-              <w:bottom w:w="105" w:type="dxa"/>
-              <w:right w:w="150" w:type="dxa"/>
-            </w:tcMar>
-          </w:tcPr>
-          <w:p>
-            <w:r>
-              <w:t xml:space="preserve">Consumer Secret</w:t>
-            </w:r>
-          </w:p>
-        </w:tc>
-        <w:tc>
-          <w:tcPr>
-            <w:tcW w:w="0" w:type="auto"/>
-            <w:tcBorders>
-              <w:top w:val="single" w:sz="6" w:space="0" w:color="auto"/>
-              <w:left w:val="single" w:sz="6" w:space="0" w:color="auto"/>
-              <w:bottom w:val="single" w:sz="6" w:space="0" w:color="auto"/>
-              <w:right w:val="single" w:sz="6" w:space="0" w:color="auto"/>
-            </w:tcBorders>
-            <w:tcMar>
-              <w:top w:w="105" w:type="dxa"/>
-              <w:left w:w="150" w:type="dxa"/>
-              <w:bottom w:w="105" w:type="dxa"/>
-              <w:right w:w="150" w:type="dxa"/>
-            </w:tcMar>
-          </w:tcPr>
-          <w:p>
-            <w:r>
-              <w:rPr>
-                <w:rFonts w:ascii="Consolas" w:hAnsi="Consolas"/>
-              </w:rPr>
-              <w:t xml:space="preserve">clientSecret</w:t>
-            </w:r>
-          </w:p>
-        </w:tc>
-      </w:tr>
-    </w:tbl>
-    <w:p>
-      <w:r>
-        <w:rPr>
-          <w:b/>
-          <w:bCs/>
-        </w:rPr>
-        <w:t xml:space="preserve">Note: </w:t>
-      </w:r>
-      <w:r>
-        <w:t xml:space="preserve">The Consumer Secret is a credential in its own right. Treat it the way the integration user’s password was treated.</w:t>
-      </w:r>
-    </w:p>
-    <w:p/>
-    <w:p>
-      <w:r>
-        <w:rPr>
-          <w:b/>
-          <w:bCs/>
-        </w:rPr>
-        <w:t xml:space="preserve">Step 5 - Service Account Permissions</w:t>
-      </w:r>
-    </w:p>
-    <w:p>
-      <w:r>
-        <w:t xml:space="preserve">Record the Run As user’s configuration here so the effective access is documented:</w:t>
-      </w:r>
-    </w:p>
-    <w:tbl>
-      <w:tblPr>
-        <w:tblW w:w="0" w:type="auto"/>
-        <w:tblCellMar>
-          <w:left w:w="0" w:type="dxa"/>
-          <w:right w:w="0" w:type="dxa"/>
-        </w:tblCellMar>
-        <w:tblLook w:val="04A0" w:firstRow="1" w:lastRow="0" w:firstColumn="1" w:lastColumn="0" w:noHBand="0" w:noVBand="1"/>
-      </w:tblPr>
-      <w:tblGrid>
-        <w:gridCol w:w="2600"/>
-        <w:gridCol w:w="4200"/>
-      </w:tblGrid>
-      <w:tr>
-        <w:trPr>
-          <w:tblHeader/>
-        </w:trPr>
+              <w:t xml:space="preserve">Where</w:t>
+            </w:r>
+          </w:p>
+        </w:tc>
         <w:tc>
           <w:tcPr>
             <w:tcW w:w="0" w:type="auto"/>
@@ -608,33 +157,7 @@
                 <w:b/>
                 <w:bCs/>
               </w:rPr>
-              <w:t xml:space="preserve">Setting</w:t>
-            </w:r>
-          </w:p>
-        </w:tc>
-        <w:tc>
-          <w:tcPr>
-            <w:tcW w:w="0" w:type="auto"/>
-            <w:tcBorders>
-              <w:top w:val="single" w:sz="6" w:space="0" w:color="auto"/>
-              <w:left w:val="single" w:sz="6" w:space="0" w:color="auto"/>
-              <w:bottom w:val="single" w:sz="6" w:space="0" w:color="auto"/>
-              <w:right w:val="single" w:sz="6" w:space="0" w:color="auto"/>
-            </w:tcBorders>
-            <w:tcMar>
-              <w:top w:w="105" w:type="dxa"/>
-              <w:left w:w="150" w:type="dxa"/>
-              <w:bottom w:w="105" w:type="dxa"/>
-              <w:right w:w="150" w:type="dxa"/>
-            </w:tcMar>
-          </w:tcPr>
-          <w:p>
-            <w:r>
-              <w:rPr>
-                <w:b/>
-                <w:bCs/>
-              </w:rPr>
-              <w:t xml:space="preserve">Value</w:t>
+              <w:t xml:space="preserve">Goal</w:t>
             </w:r>
           </w:p>
         </w:tc>
@@ -658,29 +181,51 @@
           </w:tcPr>
           <w:p>
             <w:r>
-              <w:t xml:space="preserve">Username</w:t>
-            </w:r>
-          </w:p>
-        </w:tc>
-        <w:tc>
-          <w:tcPr>
-            <w:tcW w:w="0" w:type="auto"/>
-            <w:tcBorders>
-              <w:top w:val="single" w:sz="6" w:space="0" w:color="auto"/>
-              <w:left w:val="single" w:sz="6" w:space="0" w:color="auto"/>
-              <w:bottom w:val="single" w:sz="6" w:space="0" w:color="auto"/>
-              <w:right w:val="single" w:sz="6" w:space="0" w:color="auto"/>
-            </w:tcBorders>
-            <w:tcMar>
-              <w:top w:w="105" w:type="dxa"/>
-              <w:left w:w="150" w:type="dxa"/>
-              <w:bottom w:w="105" w:type="dxa"/>
-              <w:right w:w="150" w:type="dxa"/>
-            </w:tcMar>
-          </w:tcPr>
-          <w:p>
-            <w:r>
-              <w:t xml:space="preserve">&lt;Run As user&gt;</w:t>
+              <w:t xml:space="preserve">Part 1</w:t>
+            </w:r>
+          </w:p>
+        </w:tc>
+        <w:tc>
+          <w:tcPr>
+            <w:tcW w:w="0" w:type="auto"/>
+            <w:tcBorders>
+              <w:top w:val="single" w:sz="6" w:space="0" w:color="auto"/>
+              <w:left w:val="single" w:sz="6" w:space="0" w:color="auto"/>
+              <w:bottom w:val="single" w:sz="6" w:space="0" w:color="auto"/>
+              <w:right w:val="single" w:sz="6" w:space="0" w:color="auto"/>
+            </w:tcBorders>
+            <w:tcMar>
+              <w:top w:w="105" w:type="dxa"/>
+              <w:left w:w="150" w:type="dxa"/>
+              <w:bottom w:w="105" w:type="dxa"/>
+              <w:right w:w="150" w:type="dxa"/>
+            </w:tcMar>
+          </w:tcPr>
+          <w:p>
+            <w:r>
+              <w:t xml:space="preserve">Salesforce</w:t>
+            </w:r>
+          </w:p>
+        </w:tc>
+        <w:tc>
+          <w:tcPr>
+            <w:tcW w:w="0" w:type="auto"/>
+            <w:tcBorders>
+              <w:top w:val="single" w:sz="6" w:space="0" w:color="auto"/>
+              <w:left w:val="single" w:sz="6" w:space="0" w:color="auto"/>
+              <w:bottom w:val="single" w:sz="6" w:space="0" w:color="auto"/>
+              <w:right w:val="single" w:sz="6" w:space="0" w:color="auto"/>
+            </w:tcBorders>
+            <w:tcMar>
+              <w:top w:w="105" w:type="dxa"/>
+              <w:left w:w="150" w:type="dxa"/>
+              <w:bottom w:w="105" w:type="dxa"/>
+              <w:right w:w="150" w:type="dxa"/>
+            </w:tcMar>
+          </w:tcPr>
+          <w:p>
+            <w:r>
+              <w:t xml:space="preserve">Create the External Client App and get the Client ID and Client Secret.</w:t>
             </w:r>
           </w:p>
         </w:tc>
@@ -704,29 +249,51 @@
           </w:tcPr>
           <w:p>
             <w:r>
-              <w:t xml:space="preserve">Profile</w:t>
-            </w:r>
-          </w:p>
-        </w:tc>
-        <w:tc>
-          <w:tcPr>
-            <w:tcW w:w="0" w:type="auto"/>
-            <w:tcBorders>
-              <w:top w:val="single" w:sz="6" w:space="0" w:color="auto"/>
-              <w:left w:val="single" w:sz="6" w:space="0" w:color="auto"/>
-              <w:bottom w:val="single" w:sz="6" w:space="0" w:color="auto"/>
-              <w:right w:val="single" w:sz="6" w:space="0" w:color="auto"/>
-            </w:tcBorders>
-            <w:tcMar>
-              <w:top w:w="105" w:type="dxa"/>
-              <w:left w:w="150" w:type="dxa"/>
-              <w:bottom w:w="105" w:type="dxa"/>
-              <w:right w:w="150" w:type="dxa"/>
-            </w:tcMar>
-          </w:tcPr>
-          <w:p>
-            <w:r>
-              <w:t xml:space="preserve">&lt;profile name&gt;</w:t>
+              <w:t xml:space="preserve">Part 2</w:t>
+            </w:r>
+          </w:p>
+        </w:tc>
+        <w:tc>
+          <w:tcPr>
+            <w:tcW w:w="0" w:type="auto"/>
+            <w:tcBorders>
+              <w:top w:val="single" w:sz="6" w:space="0" w:color="auto"/>
+              <w:left w:val="single" w:sz="6" w:space="0" w:color="auto"/>
+              <w:bottom w:val="single" w:sz="6" w:space="0" w:color="auto"/>
+              <w:right w:val="single" w:sz="6" w:space="0" w:color="auto"/>
+            </w:tcBorders>
+            <w:tcMar>
+              <w:top w:w="105" w:type="dxa"/>
+              <w:left w:w="150" w:type="dxa"/>
+              <w:bottom w:w="105" w:type="dxa"/>
+              <w:right w:w="150" w:type="dxa"/>
+            </w:tcMar>
+          </w:tcPr>
+          <w:p>
+            <w:r>
+              <w:t xml:space="preserve">UAT server</w:t>
+            </w:r>
+          </w:p>
+        </w:tc>
+        <w:tc>
+          <w:tcPr>
+            <w:tcW w:w="0" w:type="auto"/>
+            <w:tcBorders>
+              <w:top w:val="single" w:sz="6" w:space="0" w:color="auto"/>
+              <w:left w:val="single" w:sz="6" w:space="0" w:color="auto"/>
+              <w:bottom w:val="single" w:sz="6" w:space="0" w:color="auto"/>
+              <w:right w:val="single" w:sz="6" w:space="0" w:color="auto"/>
+            </w:tcBorders>
+            <w:tcMar>
+              <w:top w:w="105" w:type="dxa"/>
+              <w:left w:w="150" w:type="dxa"/>
+              <w:bottom w:w="105" w:type="dxa"/>
+              <w:right w:w="150" w:type="dxa"/>
+            </w:tcMar>
+          </w:tcPr>
+          <w:p>
+            <w:r>
+              <w:t xml:space="preserve">Install the Salesforce CLI. The server does not have it yet.</w:t>
             </w:r>
           </w:p>
         </w:tc>
@@ -750,29 +317,51 @@
           </w:tcPr>
           <w:p>
             <w:r>
-              <w:t xml:space="preserve">Permission sets</w:t>
-            </w:r>
-          </w:p>
-        </w:tc>
-        <w:tc>
-          <w:tcPr>
-            <w:tcW w:w="0" w:type="auto"/>
-            <w:tcBorders>
-              <w:top w:val="single" w:sz="6" w:space="0" w:color="auto"/>
-              <w:left w:val="single" w:sz="6" w:space="0" w:color="auto"/>
-              <w:bottom w:val="single" w:sz="6" w:space="0" w:color="auto"/>
-              <w:right w:val="single" w:sz="6" w:space="0" w:color="auto"/>
-            </w:tcBorders>
-            <w:tcMar>
-              <w:top w:w="105" w:type="dxa"/>
-              <w:left w:w="150" w:type="dxa"/>
-              <w:bottom w:w="105" w:type="dxa"/>
-              <w:right w:w="150" w:type="dxa"/>
-            </w:tcMar>
-          </w:tcPr>
-          <w:p>
-            <w:r>
-              <w:t xml:space="preserve">&lt;permission sets assigned&gt;</w:t>
+              <w:t xml:space="preserve">Part 3</w:t>
+            </w:r>
+          </w:p>
+        </w:tc>
+        <w:tc>
+          <w:tcPr>
+            <w:tcW w:w="0" w:type="auto"/>
+            <w:tcBorders>
+              <w:top w:val="single" w:sz="6" w:space="0" w:color="auto"/>
+              <w:left w:val="single" w:sz="6" w:space="0" w:color="auto"/>
+              <w:bottom w:val="single" w:sz="6" w:space="0" w:color="auto"/>
+              <w:right w:val="single" w:sz="6" w:space="0" w:color="auto"/>
+            </w:tcBorders>
+            <w:tcMar>
+              <w:top w:w="105" w:type="dxa"/>
+              <w:left w:w="150" w:type="dxa"/>
+              <w:bottom w:w="105" w:type="dxa"/>
+              <w:right w:w="150" w:type="dxa"/>
+            </w:tcMar>
+          </w:tcPr>
+          <w:p>
+            <w:r>
+              <w:t xml:space="preserve">UAT server</w:t>
+            </w:r>
+          </w:p>
+        </w:tc>
+        <w:tc>
+          <w:tcPr>
+            <w:tcW w:w="0" w:type="auto"/>
+            <w:tcBorders>
+              <w:top w:val="single" w:sz="6" w:space="0" w:color="auto"/>
+              <w:left w:val="single" w:sz="6" w:space="0" w:color="auto"/>
+              <w:bottom w:val="single" w:sz="6" w:space="0" w:color="auto"/>
+              <w:right w:val="single" w:sz="6" w:space="0" w:color="auto"/>
+            </w:tcBorders>
+            <w:tcMar>
+              <w:top w:w="105" w:type="dxa"/>
+              <w:left w:w="150" w:type="dxa"/>
+              <w:bottom w:w="105" w:type="dxa"/>
+              <w:right w:w="150" w:type="dxa"/>
+            </w:tcMar>
+          </w:tcPr>
+          <w:p>
+            <w:r>
+              <w:t xml:space="preserve">Save the ID and Secret into one shared settings file.</w:t>
             </w:r>
           </w:p>
         </w:tc>
@@ -796,75 +385,51 @@
           </w:tcPr>
           <w:p>
             <w:r>
-              <w:t xml:space="preserve">UI access restriction</w:t>
-            </w:r>
-          </w:p>
-        </w:tc>
-        <w:tc>
-          <w:tcPr>
-            <w:tcW w:w="0" w:type="auto"/>
-            <w:tcBorders>
-              <w:top w:val="single" w:sz="6" w:space="0" w:color="auto"/>
-              <w:left w:val="single" w:sz="6" w:space="0" w:color="auto"/>
-              <w:bottom w:val="single" w:sz="6" w:space="0" w:color="auto"/>
-              <w:right w:val="single" w:sz="6" w:space="0" w:color="auto"/>
-            </w:tcBorders>
-            <w:tcMar>
-              <w:top w:w="105" w:type="dxa"/>
-              <w:left w:w="150" w:type="dxa"/>
-              <w:bottom w:w="105" w:type="dxa"/>
-              <w:right w:w="150" w:type="dxa"/>
-            </w:tcMar>
-          </w:tcPr>
-          <w:p>
-            <w:r>
-              <w:t xml:space="preserve">&lt;API Enabled / API Only User, as applicable&gt;</w:t>
-            </w:r>
-          </w:p>
-        </w:tc>
-      </w:tr>
-      <w:tr>
-        <w:tc>
-          <w:tcPr>
-            <w:tcW w:w="0" w:type="auto"/>
-            <w:tcBorders>
-              <w:top w:val="single" w:sz="6" w:space="0" w:color="auto"/>
-              <w:left w:val="single" w:sz="6" w:space="0" w:color="auto"/>
-              <w:bottom w:val="single" w:sz="6" w:space="0" w:color="auto"/>
-              <w:right w:val="single" w:sz="6" w:space="0" w:color="auto"/>
-            </w:tcBorders>
-            <w:tcMar>
-              <w:top w:w="105" w:type="dxa"/>
-              <w:left w:w="150" w:type="dxa"/>
-              <w:bottom w:w="105" w:type="dxa"/>
-              <w:right w:w="150" w:type="dxa"/>
-            </w:tcMar>
-          </w:tcPr>
-          <w:p>
-            <w:r>
-              <w:t xml:space="preserve">Login IP ranges</w:t>
-            </w:r>
-          </w:p>
-        </w:tc>
-        <w:tc>
-          <w:tcPr>
-            <w:tcW w:w="0" w:type="auto"/>
-            <w:tcBorders>
-              <w:top w:val="single" w:sz="6" w:space="0" w:color="auto"/>
-              <w:left w:val="single" w:sz="6" w:space="0" w:color="auto"/>
-              <w:bottom w:val="single" w:sz="6" w:space="0" w:color="auto"/>
-              <w:right w:val="single" w:sz="6" w:space="0" w:color="auto"/>
-            </w:tcBorders>
-            <w:tcMar>
-              <w:top w:w="105" w:type="dxa"/>
-              <w:left w:w="150" w:type="dxa"/>
-              <w:bottom w:w="105" w:type="dxa"/>
-              <w:right w:w="150" w:type="dxa"/>
-            </w:tcMar>
-          </w:tcPr>
-          <w:p>
-            <w:r>
-              <w:t xml:space="preserve">&lt;ranges applied to this account&gt;</w:t>
+              <w:t xml:space="preserve">Part 4</w:t>
+            </w:r>
+          </w:p>
+        </w:tc>
+        <w:tc>
+          <w:tcPr>
+            <w:tcW w:w="0" w:type="auto"/>
+            <w:tcBorders>
+              <w:top w:val="single" w:sz="6" w:space="0" w:color="auto"/>
+              <w:left w:val="single" w:sz="6" w:space="0" w:color="auto"/>
+              <w:bottom w:val="single" w:sz="6" w:space="0" w:color="auto"/>
+              <w:right w:val="single" w:sz="6" w:space="0" w:color="auto"/>
+            </w:tcBorders>
+            <w:tcMar>
+              <w:top w:w="105" w:type="dxa"/>
+              <w:left w:w="150" w:type="dxa"/>
+              <w:bottom w:w="105" w:type="dxa"/>
+              <w:right w:w="150" w:type="dxa"/>
+            </w:tcMar>
+          </w:tcPr>
+          <w:p>
+            <w:r>
+              <w:t xml:space="preserve">UAT server</w:t>
+            </w:r>
+          </w:p>
+        </w:tc>
+        <w:tc>
+          <w:tcPr>
+            <w:tcW w:w="0" w:type="auto"/>
+            <w:tcBorders>
+              <w:top w:val="single" w:sz="6" w:space="0" w:color="auto"/>
+              <w:left w:val="single" w:sz="6" w:space="0" w:color="auto"/>
+              <w:bottom w:val="single" w:sz="6" w:space="0" w:color="auto"/>
+              <w:right w:val="single" w:sz="6" w:space="0" w:color="auto"/>
+            </w:tcBorders>
+            <w:tcMar>
+              <w:top w:w="105" w:type="dxa"/>
+              <w:left w:w="150" w:type="dxa"/>
+              <w:bottom w:w="105" w:type="dxa"/>
+              <w:right w:w="150" w:type="dxa"/>
+            </w:tcMar>
+          </w:tcPr>
+          <w:p>
+            <w:r>
+              <w:t xml:space="preserve">Remove the old login lines from the bean file, then test.</w:t>
             </w:r>
           </w:p>
         </w:tc>
@@ -879,7 +444,7 @@
         <w:t xml:space="preserve">Note: </w:t>
       </w:r>
       <w:r>
-        <w:t xml:space="preserve">If Login IP Ranges are enforced on the Run As user or its profile, the batch server’s outbound address must fall inside them or the token request is refused.</w:t>
+        <w:t xml:space="preserve">Part 1 needs Salesforce administrator access. Parts 2 to 4 need permission to install software on the UAT server.</w:t>
       </w:r>
     </w:p>
     <w:p/>
@@ -895,567 +460,16 @@
           <w:b/>
           <w:bCs/>
         </w:rPr>
-        <w:t xml:space="preserve">Batch Server Configuration</w:t>
-      </w:r>
-    </w:p>
-    <w:p>
-      <w:r>
-        <w:rPr>
-          <w:b/>
-          <w:bCs/>
-        </w:rPr>
-        <w:t xml:space="preserve">Authentication Flow: </w:t>
-      </w:r>
-      <w:r>
-        <w:t xml:space="preserve">The Data Loader jobs authenticate using the OAuth 2.0 Client Credentials Grant. This is a server-to-server flow. There is no browser redirect, no consent screen, no refresh token and no interactive login, which is what makes it suitable for unattended jobs running on a schedule.</w:t>
-      </w:r>
-    </w:p>
-    <w:p/>
-    <w:p>
-      <w:r>
-        <w:rPr>
-          <w:b/>
-          <w:bCs/>
-        </w:rPr>
-        <w:t xml:space="preserve">Step 1 - Install the Salesforce CLI on the UAT server</w:t>
-      </w:r>
-    </w:p>
-    <w:p>
-      <w:r>
-        <w:t xml:space="preserve">The jobs run their queries and bulk loads through the Salesforce CLI, so it must be installed on the server before anything else is tested. Install it once, for the whole machine, not for a single user profile.</w:t>
-      </w:r>
-    </w:p>
-    <w:p>
-      <w:r>
-        <w:rPr>
-          <w:b/>
-          <w:bCs/>
-        </w:rPr>
-        <w:t xml:space="preserve">Option A - Windows installer (recommended for a server)</w:t>
-      </w:r>
-    </w:p>
-    <w:p>
-      <w:r>
-        <w:t xml:space="preserve">Download the Windows installer from the Salesforce CLI download page and run it as an administrator. It bundles its own Node.js runtime, so nothing else has to be installed, and it adds the CLI to the system PATH:</w:t>
-      </w:r>
-    </w:p>
-    <w:p>
-      <w:r>
-        <w:rPr>
-          <w:rFonts w:ascii="Consolas" w:hAnsi="Consolas"/>
-        </w:rPr>
-        <w:t xml:space="preserve">https://developer.salesforce.com/tools/salesforcecli</w:t>
-      </w:r>
-    </w:p>
-    <w:p>
-      <w:r>
-        <w:t xml:space="preserve">The installer places the CLI in its own Program Files folder, for example:</w:t>
-      </w:r>
-    </w:p>
-    <w:p>
-      <w:r>
-        <w:rPr>
-          <w:rFonts w:ascii="Consolas" w:hAnsi="Consolas"/>
-        </w:rPr>
-        <w:t xml:space="preserve">C:\Program Files\sf\bin</w:t>
-      </w:r>
-    </w:p>
-    <w:p>
-      <w:r>
-        <w:rPr>
-          <w:b/>
-          <w:bCs/>
-        </w:rPr>
-        <w:t xml:space="preserve">Option B - npm</w:t>
-      </w:r>
-    </w:p>
-    <w:p>
-      <w:r>
-        <w:t xml:space="preserve">If Node.js is already managed on the server, the CLI can instead be installed with npm:</w:t>
-      </w:r>
-    </w:p>
-    <w:p>
-      <w:r>
-        <w:rPr>
-          <w:rFonts w:ascii="Consolas" w:hAnsi="Consolas"/>
-        </w:rPr>
-        <w:t xml:space="preserve">npm install --global @salesforce/cli</w:t>
-      </w:r>
-    </w:p>
-    <w:p>
-      <w:r>
-        <w:rPr>
-          <w:b/>
-          <w:bCs/>
-        </w:rPr>
-        <w:t xml:space="preserve">Note: </w:t>
-      </w:r>
-      <w:r>
-        <w:t xml:space="preserve">If the UAT server has no internet access, download the installer on a machine that does and copy it across. The CLI does not need internet access at run time. It only needs to reach the Salesforce org.</w:t>
-      </w:r>
-    </w:p>
-    <w:p/>
-    <w:p>
-      <w:r>
-        <w:rPr>
-          <w:b/>
-          <w:bCs/>
-        </w:rPr>
-        <w:t xml:space="preserve">Verify the installation</w:t>
-      </w:r>
-    </w:p>
-    <w:p>
-      <w:r>
-        <w:t xml:space="preserve">Open a new Command Prompt, so it picks up the updated PATH, and confirm the CLI responds:</w:t>
-      </w:r>
-    </w:p>
-    <w:p>
-      <w:r>
-        <w:rPr>
-          <w:rFonts w:ascii="Consolas" w:hAnsi="Consolas"/>
-        </w:rPr>
-        <w:t xml:space="preserve">sf --version</w:t>
-      </w:r>
-    </w:p>
-    <w:p>
-      <w:r>
-        <w:t xml:space="preserve">Then confirm the specific commands the jobs use are present in the installed release. Each of these should print help rather than an error:</w:t>
-      </w:r>
-    </w:p>
-    <w:tbl>
-      <w:tblPr>
-        <w:tblW w:w="0" w:type="auto"/>
-        <w:tblCellMar>
-          <w:left w:w="0" w:type="dxa"/>
-          <w:right w:w="0" w:type="dxa"/>
-        </w:tblCellMar>
-        <w:tblLook w:val="04A0" w:firstRow="1" w:lastRow="0" w:firstColumn="1" w:lastColumn="0" w:noHBand="0" w:noVBand="1"/>
-      </w:tblPr>
-      <w:tblGrid>
-        <w:gridCol w:w="3600"/>
-        <w:gridCol w:w="3600"/>
-      </w:tblGrid>
-      <w:tr>
-        <w:trPr>
-          <w:tblHeader/>
-        </w:trPr>
-        <w:tc>
-          <w:tcPr>
-            <w:tcW w:w="0" w:type="auto"/>
-            <w:tcBorders>
-              <w:top w:val="single" w:sz="6" w:space="0" w:color="auto"/>
-              <w:left w:val="single" w:sz="6" w:space="0" w:color="auto"/>
-              <w:bottom w:val="single" w:sz="6" w:space="0" w:color="auto"/>
-              <w:right w:val="single" w:sz="6" w:space="0" w:color="auto"/>
-            </w:tcBorders>
-            <w:tcMar>
-              <w:top w:w="105" w:type="dxa"/>
-              <w:left w:w="150" w:type="dxa"/>
-              <w:bottom w:w="105" w:type="dxa"/>
-              <w:right w:w="150" w:type="dxa"/>
-            </w:tcMar>
-          </w:tcPr>
-          <w:p>
-            <w:r>
-              <w:rPr>
-                <w:b/>
-                <w:bCs/>
-              </w:rPr>
-              <w:t xml:space="preserve">Command</w:t>
-            </w:r>
-          </w:p>
-        </w:tc>
-        <w:tc>
-          <w:tcPr>
-            <w:tcW w:w="0" w:type="auto"/>
-            <w:tcBorders>
-              <w:top w:val="single" w:sz="6" w:space="0" w:color="auto"/>
-              <w:left w:val="single" w:sz="6" w:space="0" w:color="auto"/>
-              <w:bottom w:val="single" w:sz="6" w:space="0" w:color="auto"/>
-              <w:right w:val="single" w:sz="6" w:space="0" w:color="auto"/>
-            </w:tcBorders>
-            <w:tcMar>
-              <w:top w:w="105" w:type="dxa"/>
-              <w:left w:w="150" w:type="dxa"/>
-              <w:bottom w:w="105" w:type="dxa"/>
-              <w:right w:w="150" w:type="dxa"/>
-            </w:tcMar>
-          </w:tcPr>
-          <w:p>
-            <w:r>
-              <w:rPr>
-                <w:b/>
-                <w:bCs/>
-              </w:rPr>
-              <w:t xml:space="preserve">Used for</w:t>
-            </w:r>
-          </w:p>
-        </w:tc>
-      </w:tr>
-      <w:tr>
-        <w:tc>
-          <w:tcPr>
-            <w:tcW w:w="0" w:type="auto"/>
-            <w:tcBorders>
-              <w:top w:val="single" w:sz="6" w:space="0" w:color="auto"/>
-              <w:left w:val="single" w:sz="6" w:space="0" w:color="auto"/>
-              <w:bottom w:val="single" w:sz="6" w:space="0" w:color="auto"/>
-              <w:right w:val="single" w:sz="6" w:space="0" w:color="auto"/>
-            </w:tcBorders>
-            <w:tcMar>
-              <w:top w:w="105" w:type="dxa"/>
-              <w:left w:w="150" w:type="dxa"/>
-              <w:bottom w:w="105" w:type="dxa"/>
-              <w:right w:w="150" w:type="dxa"/>
-            </w:tcMar>
-          </w:tcPr>
-          <w:p>
-            <w:r>
-              <w:rPr>
-                <w:rFonts w:ascii="Consolas" w:hAnsi="Consolas"/>
-              </w:rPr>
-              <w:t xml:space="preserve">sf org login access-token --help</w:t>
-            </w:r>
-          </w:p>
-        </w:tc>
-        <w:tc>
-          <w:tcPr>
-            <w:tcW w:w="0" w:type="auto"/>
-            <w:tcBorders>
-              <w:top w:val="single" w:sz="6" w:space="0" w:color="auto"/>
-              <w:left w:val="single" w:sz="6" w:space="0" w:color="auto"/>
-              <w:bottom w:val="single" w:sz="6" w:space="0" w:color="auto"/>
-              <w:right w:val="single" w:sz="6" w:space="0" w:color="auto"/>
-            </w:tcBorders>
-            <w:tcMar>
-              <w:top w:w="105" w:type="dxa"/>
-              <w:left w:w="150" w:type="dxa"/>
-              <w:bottom w:w="105" w:type="dxa"/>
-              <w:right w:w="150" w:type="dxa"/>
-            </w:tcMar>
-          </w:tcPr>
-          <w:p>
-            <w:r>
-              <w:t xml:space="preserve">Handing the OAuth token to the CLI</w:t>
-            </w:r>
-          </w:p>
-        </w:tc>
-      </w:tr>
-      <w:tr>
-        <w:tc>
-          <w:tcPr>
-            <w:tcW w:w="0" w:type="auto"/>
-            <w:tcBorders>
-              <w:top w:val="single" w:sz="6" w:space="0" w:color="auto"/>
-              <w:left w:val="single" w:sz="6" w:space="0" w:color="auto"/>
-              <w:bottom w:val="single" w:sz="6" w:space="0" w:color="auto"/>
-              <w:right w:val="single" w:sz="6" w:space="0" w:color="auto"/>
-            </w:tcBorders>
-            <w:tcMar>
-              <w:top w:w="105" w:type="dxa"/>
-              <w:left w:w="150" w:type="dxa"/>
-              <w:bottom w:w="105" w:type="dxa"/>
-              <w:right w:w="150" w:type="dxa"/>
-            </w:tcMar>
-          </w:tcPr>
-          <w:p>
-            <w:r>
-              <w:rPr>
-                <w:rFonts w:ascii="Consolas" w:hAnsi="Consolas"/>
-              </w:rPr>
-              <w:t xml:space="preserve">sf data query --help</w:t>
-            </w:r>
-          </w:p>
-        </w:tc>
-        <w:tc>
-          <w:tcPr>
-            <w:tcW w:w="0" w:type="auto"/>
-            <w:tcBorders>
-              <w:top w:val="single" w:sz="6" w:space="0" w:color="auto"/>
-              <w:left w:val="single" w:sz="6" w:space="0" w:color="auto"/>
-              <w:bottom w:val="single" w:sz="6" w:space="0" w:color="auto"/>
-              <w:right w:val="single" w:sz="6" w:space="0" w:color="auto"/>
-            </w:tcBorders>
-            <w:tcMar>
-              <w:top w:w="105" w:type="dxa"/>
-              <w:left w:w="150" w:type="dxa"/>
-              <w:bottom w:w="105" w:type="dxa"/>
-              <w:right w:w="150" w:type="dxa"/>
-            </w:tcMar>
-          </w:tcPr>
-          <w:p>
-            <w:r>
-              <w:t xml:space="preserve">The extract and backup jobs</w:t>
-            </w:r>
-          </w:p>
-        </w:tc>
-      </w:tr>
-      <w:tr>
-        <w:tc>
-          <w:tcPr>
-            <w:tcW w:w="0" w:type="auto"/>
-            <w:tcBorders>
-              <w:top w:val="single" w:sz="6" w:space="0" w:color="auto"/>
-              <w:left w:val="single" w:sz="6" w:space="0" w:color="auto"/>
-              <w:bottom w:val="single" w:sz="6" w:space="0" w:color="auto"/>
-              <w:right w:val="single" w:sz="6" w:space="0" w:color="auto"/>
-            </w:tcBorders>
-            <w:tcMar>
-              <w:top w:w="105" w:type="dxa"/>
-              <w:left w:w="150" w:type="dxa"/>
-              <w:bottom w:w="105" w:type="dxa"/>
-              <w:right w:w="150" w:type="dxa"/>
-            </w:tcMar>
-          </w:tcPr>
-          <w:p>
-            <w:r>
-              <w:rPr>
-                <w:rFonts w:ascii="Consolas" w:hAnsi="Consolas"/>
-              </w:rPr>
-              <w:t xml:space="preserve">sf data import bulk --help</w:t>
-            </w:r>
-          </w:p>
-        </w:tc>
-        <w:tc>
-          <w:tcPr>
-            <w:tcW w:w="0" w:type="auto"/>
-            <w:tcBorders>
-              <w:top w:val="single" w:sz="6" w:space="0" w:color="auto"/>
-              <w:left w:val="single" w:sz="6" w:space="0" w:color="auto"/>
-              <w:bottom w:val="single" w:sz="6" w:space="0" w:color="auto"/>
-              <w:right w:val="single" w:sz="6" w:space="0" w:color="auto"/>
-            </w:tcBorders>
-            <w:tcMar>
-              <w:top w:w="105" w:type="dxa"/>
-              <w:left w:w="150" w:type="dxa"/>
-              <w:bottom w:w="105" w:type="dxa"/>
-              <w:right w:w="150" w:type="dxa"/>
-            </w:tcMar>
-          </w:tcPr>
-          <w:p>
-            <w:r>
-              <w:t xml:space="preserve">Insert jobs</w:t>
-            </w:r>
-          </w:p>
-        </w:tc>
-      </w:tr>
-      <w:tr>
-        <w:tc>
-          <w:tcPr>
-            <w:tcW w:w="0" w:type="auto"/>
-            <w:tcBorders>
-              <w:top w:val="single" w:sz="6" w:space="0" w:color="auto"/>
-              <w:left w:val="single" w:sz="6" w:space="0" w:color="auto"/>
-              <w:bottom w:val="single" w:sz="6" w:space="0" w:color="auto"/>
-              <w:right w:val="single" w:sz="6" w:space="0" w:color="auto"/>
-            </w:tcBorders>
-            <w:tcMar>
-              <w:top w:w="105" w:type="dxa"/>
-              <w:left w:w="150" w:type="dxa"/>
-              <w:bottom w:w="105" w:type="dxa"/>
-              <w:right w:w="150" w:type="dxa"/>
-            </w:tcMar>
-          </w:tcPr>
-          <w:p>
-            <w:r>
-              <w:rPr>
-                <w:rFonts w:ascii="Consolas" w:hAnsi="Consolas"/>
-              </w:rPr>
-              <w:t xml:space="preserve">sf data update bulk --help</w:t>
-            </w:r>
-          </w:p>
-        </w:tc>
-        <w:tc>
-          <w:tcPr>
-            <w:tcW w:w="0" w:type="auto"/>
-            <w:tcBorders>
-              <w:top w:val="single" w:sz="6" w:space="0" w:color="auto"/>
-              <w:left w:val="single" w:sz="6" w:space="0" w:color="auto"/>
-              <w:bottom w:val="single" w:sz="6" w:space="0" w:color="auto"/>
-              <w:right w:val="single" w:sz="6" w:space="0" w:color="auto"/>
-            </w:tcBorders>
-            <w:tcMar>
-              <w:top w:w="105" w:type="dxa"/>
-              <w:left w:w="150" w:type="dxa"/>
-              <w:bottom w:w="105" w:type="dxa"/>
-              <w:right w:w="150" w:type="dxa"/>
-            </w:tcMar>
-          </w:tcPr>
-          <w:p>
-            <w:r>
-              <w:t xml:space="preserve">Update jobs</w:t>
-            </w:r>
-          </w:p>
-        </w:tc>
-      </w:tr>
-      <w:tr>
-        <w:tc>
-          <w:tcPr>
-            <w:tcW w:w="0" w:type="auto"/>
-            <w:tcBorders>
-              <w:top w:val="single" w:sz="6" w:space="0" w:color="auto"/>
-              <w:left w:val="single" w:sz="6" w:space="0" w:color="auto"/>
-              <w:bottom w:val="single" w:sz="6" w:space="0" w:color="auto"/>
-              <w:right w:val="single" w:sz="6" w:space="0" w:color="auto"/>
-            </w:tcBorders>
-            <w:tcMar>
-              <w:top w:w="105" w:type="dxa"/>
-              <w:left w:w="150" w:type="dxa"/>
-              <w:bottom w:w="105" w:type="dxa"/>
-              <w:right w:w="150" w:type="dxa"/>
-            </w:tcMar>
-          </w:tcPr>
-          <w:p>
-            <w:r>
-              <w:rPr>
-                <w:rFonts w:ascii="Consolas" w:hAnsi="Consolas"/>
-              </w:rPr>
-              <w:t xml:space="preserve">sf data upsert bulk --help</w:t>
-            </w:r>
-          </w:p>
-        </w:tc>
-        <w:tc>
-          <w:tcPr>
-            <w:tcW w:w="0" w:type="auto"/>
-            <w:tcBorders>
-              <w:top w:val="single" w:sz="6" w:space="0" w:color="auto"/>
-              <w:left w:val="single" w:sz="6" w:space="0" w:color="auto"/>
-              <w:bottom w:val="single" w:sz="6" w:space="0" w:color="auto"/>
-              <w:right w:val="single" w:sz="6" w:space="0" w:color="auto"/>
-            </w:tcBorders>
-            <w:tcMar>
-              <w:top w:w="105" w:type="dxa"/>
-              <w:left w:w="150" w:type="dxa"/>
-              <w:bottom w:w="105" w:type="dxa"/>
-              <w:right w:w="150" w:type="dxa"/>
-            </w:tcMar>
-          </w:tcPr>
-          <w:p>
-            <w:r>
-              <w:t xml:space="preserve">Upsert jobs</w:t>
-            </w:r>
-          </w:p>
-        </w:tc>
-      </w:tr>
-      <w:tr>
-        <w:tc>
-          <w:tcPr>
-            <w:tcW w:w="0" w:type="auto"/>
-            <w:tcBorders>
-              <w:top w:val="single" w:sz="6" w:space="0" w:color="auto"/>
-              <w:left w:val="single" w:sz="6" w:space="0" w:color="auto"/>
-              <w:bottom w:val="single" w:sz="6" w:space="0" w:color="auto"/>
-              <w:right w:val="single" w:sz="6" w:space="0" w:color="auto"/>
-            </w:tcBorders>
-            <w:tcMar>
-              <w:top w:w="105" w:type="dxa"/>
-              <w:left w:w="150" w:type="dxa"/>
-              <w:bottom w:w="105" w:type="dxa"/>
-              <w:right w:w="150" w:type="dxa"/>
-            </w:tcMar>
-          </w:tcPr>
-          <w:p>
-            <w:r>
-              <w:rPr>
-                <w:rFonts w:ascii="Consolas" w:hAnsi="Consolas"/>
-              </w:rPr>
-              <w:t xml:space="preserve">sf data delete bulk --help</w:t>
-            </w:r>
-          </w:p>
-        </w:tc>
-        <w:tc>
-          <w:tcPr>
-            <w:tcW w:w="0" w:type="auto"/>
-            <w:tcBorders>
-              <w:top w:val="single" w:sz="6" w:space="0" w:color="auto"/>
-              <w:left w:val="single" w:sz="6" w:space="0" w:color="auto"/>
-              <w:bottom w:val="single" w:sz="6" w:space="0" w:color="auto"/>
-              <w:right w:val="single" w:sz="6" w:space="0" w:color="auto"/>
-            </w:tcBorders>
-            <w:tcMar>
-              <w:top w:w="105" w:type="dxa"/>
-              <w:left w:w="150" w:type="dxa"/>
-              <w:bottom w:w="105" w:type="dxa"/>
-              <w:right w:w="150" w:type="dxa"/>
-            </w:tcMar>
-          </w:tcPr>
-          <w:p>
-            <w:r>
-              <w:t xml:space="preserve">Delete jobs</w:t>
-            </w:r>
-          </w:p>
-        </w:tc>
-      </w:tr>
-      <w:tr>
-        <w:tc>
-          <w:tcPr>
-            <w:tcW w:w="0" w:type="auto"/>
-            <w:tcBorders>
-              <w:top w:val="single" w:sz="6" w:space="0" w:color="auto"/>
-              <w:left w:val="single" w:sz="6" w:space="0" w:color="auto"/>
-              <w:bottom w:val="single" w:sz="6" w:space="0" w:color="auto"/>
-              <w:right w:val="single" w:sz="6" w:space="0" w:color="auto"/>
-            </w:tcBorders>
-            <w:tcMar>
-              <w:top w:w="105" w:type="dxa"/>
-              <w:left w:w="150" w:type="dxa"/>
-              <w:bottom w:w="105" w:type="dxa"/>
-              <w:right w:w="150" w:type="dxa"/>
-            </w:tcMar>
-          </w:tcPr>
-          <w:p>
-            <w:r>
-              <w:rPr>
-                <w:rFonts w:ascii="Consolas" w:hAnsi="Consolas"/>
-              </w:rPr>
-              <w:t xml:space="preserve">sf data bulk results --help</w:t>
-            </w:r>
-          </w:p>
-        </w:tc>
-        <w:tc>
-          <w:tcPr>
-            <w:tcW w:w="0" w:type="auto"/>
-            <w:tcBorders>
-              <w:top w:val="single" w:sz="6" w:space="0" w:color="auto"/>
-              <w:left w:val="single" w:sz="6" w:space="0" w:color="auto"/>
-              <w:bottom w:val="single" w:sz="6" w:space="0" w:color="auto"/>
-              <w:right w:val="single" w:sz="6" w:space="0" w:color="auto"/>
-            </w:tcBorders>
-            <w:tcMar>
-              <w:top w:w="105" w:type="dxa"/>
-              <w:left w:w="150" w:type="dxa"/>
-              <w:bottom w:w="105" w:type="dxa"/>
-              <w:right w:w="150" w:type="dxa"/>
-            </w:tcMar>
-          </w:tcPr>
-          <w:p>
-            <w:r>
-              <w:t xml:space="preserve">Collecting the success and error files</w:t>
-            </w:r>
-          </w:p>
-        </w:tc>
-      </w:tr>
-    </w:tbl>
-    <w:p>
-      <w:r>
-        <w:rPr>
-          <w:b/>
-          <w:bCs/>
-        </w:rPr>
-        <w:t xml:space="preserve">Note: </w:t>
-      </w:r>
-      <w:r>
-        <w:t xml:space="preserve">The bulk data commands have been added to the CLI over several releases. If any of the above is not recognised, the installed CLI is too old. Upgrade it rather than working around it.</w:t>
-      </w:r>
-    </w:p>
-    <w:p/>
-    <w:p>
-      <w:r>
-        <w:rPr>
-          <w:b/>
-          <w:bCs/>
-        </w:rPr>
-        <w:t xml:space="preserve">Two things that catch a batch server out</w:t>
+        <w:t xml:space="preserve">Prerequisites</w:t>
+      </w:r>
+    </w:p>
+    <w:p>
+      <w:r>
+        <w:rPr>
+          <w:b/>
+          <w:bCs/>
+        </w:rPr>
+        <w:t xml:space="preserve">On the UAT server</w:t>
       </w:r>
     </w:p>
     <w:p>
@@ -1467,7 +481,7 @@
         <w:ind w:left="720"/>
       </w:pPr>
       <w:r>
-        <w:t xml:space="preserve">PATH. The CLI must be on the PATH of the account the scheduled task runs as, not only the administrator who installed it. Installing while signed in as one user and running the job as a service account is the most common reason a job that works by hand fails when scheduled. Confirm it by running sf --version as that account.</w:t>
+        <w:t xml:space="preserve">Salesforce CLI. This is the one genuinely new requirement, covered in Part 2.</w:t>
       </w:r>
     </w:p>
     <w:p>
@@ -1479,7 +493,31 @@
         <w:ind w:left="720"/>
       </w:pPr>
       <w:r>
-        <w:t xml:space="preserve">User profile. The CLI stores the persisted login under the running account’s user profile. That account needs a real, loadable Windows profile with write access to it. A service account that has never signed in interactively may not have one.</w:t>
+        <w:t xml:space="preserve">curl.exe and Windows PowerShell 5.1. Both already ship with Windows 10 1803, Windows Server 2019 and anything newer.</w:t>
+      </w:r>
+    </w:p>
+    <w:p>
+      <w:pPr>
+        <w:numPr>
+          <w:ilvl w:val="0"/>
+          <w:numId w:val="4"/>
+        </w:numPr>
+        <w:ind w:left="720"/>
+      </w:pPr>
+      <w:r>
+        <w:t xml:space="preserve">Outbound HTTPS on port 443 to Salesforce, and proxy settings if the server uses a proxy.</w:t>
+      </w:r>
+    </w:p>
+    <w:p>
+      <w:pPr>
+        <w:numPr>
+          <w:ilvl w:val="0"/>
+          <w:numId w:val="4"/>
+        </w:numPr>
+        <w:ind w:left="720"/>
+      </w:pPr>
+      <w:r>
+        <w:t xml:space="preserve">The name of the Windows account the scheduled jobs run as. It is often not the account you log in with, and it matters in Part 2.</w:t>
       </w:r>
     </w:p>
     <w:p>
@@ -1491,22 +529,45 @@
         <w:t xml:space="preserve">Note: </w:t>
       </w:r>
       <w:r>
-        <w:t xml:space="preserve">If the server uses a proxy, set the proxy environment variables for the job account. Both the CLI and curl.exe read them, and without them the token request fails before it ever reaches Salesforce.</w:t>
+        <w:t xml:space="preserve">After this change the jobs no longer use the Data Loader program or Java, because the Salesforce CLI does that work now. Leave both installed until every job has been moved over.</w:t>
       </w:r>
     </w:p>
     <w:p/>
     <w:p>
-      <w:r>
-        <w:rPr>
-          <w:b/>
-          <w:bCs/>
-        </w:rPr>
-        <w:t xml:space="preserve">Step 2 - Create the credentials file</w:t>
-      </w:r>
-    </w:p>
-    <w:p>
-      <w:r>
-        <w:t xml:space="preserve">The client id and client secret are held in a single JSON file, clientcreds.json, kept in the Config folder under the NLG root and shared by every job on the server:</w:t>
+      <w:pPr>
+        <w:rPr>
+          <w:b/>
+          <w:bCs/>
+        </w:rPr>
+      </w:pPr>
+      <w:r>
+        <w:rPr>
+          <w:b/>
+          <w:bCs/>
+        </w:rPr>
+        <w:t xml:space="preserve">Part 1 - Create the External Client App in Salesforce</w:t>
+      </w:r>
+    </w:p>
+    <w:p>
+      <w:r>
+        <w:rPr>
+          <w:b/>
+          <w:bCs/>
+        </w:rPr>
+        <w:t xml:space="preserve">Goal: </w:t>
+      </w:r>
+      <w:r>
+        <w:t xml:space="preserve">end up with a Client ID, a Client Secret and the org address.</w:t>
+      </w:r>
+    </w:p>
+    <w:p/>
+    <w:p>
+      <w:r>
+        <w:rPr>
+          <w:b/>
+          <w:bCs/>
+        </w:rPr>
+        <w:t xml:space="preserve">Step 1 - Create the app</w:t>
       </w:r>
     </w:p>
     <w:p>
@@ -1514,12 +575,91 @@
         <w:rPr>
           <w:rFonts w:ascii="Consolas" w:hAnsi="Consolas"/>
         </w:rPr>
-        <w:t xml:space="preserve">...\NLG\Config\clientcreds.json</w:t>
-      </w:r>
-    </w:p>
-    <w:p>
-      <w:r>
-        <w:t xml:space="preserve">It carries four keys:</w:t>
+        <w:t xml:space="preserve">Setup → Apps → External Client Apps → External Client App Manager</w:t>
+      </w:r>
+    </w:p>
+    <w:p>
+      <w:r>
+        <w:t xml:space="preserve">Select New External Client App and give it a name that makes its purpose obvious, so it is not deleted later by mistake.</w:t>
+      </w:r>
+    </w:p>
+    <w:p>
+      <w:r>
+        <w:rPr>
+          <w:b/>
+          <w:bCs/>
+        </w:rPr>
+        <w:t xml:space="preserve">[ Screenshot: External Client App Manager, new app ]</w:t>
+      </w:r>
+    </w:p>
+    <w:p/>
+    <w:p>
+      <w:r>
+        <w:rPr>
+          <w:b/>
+          <w:bCs/>
+        </w:rPr>
+        <w:t xml:space="preserve">Step 2 - Enable OAuth</w:t>
+      </w:r>
+    </w:p>
+    <w:p>
+      <w:r>
+        <w:t xml:space="preserve">In the API (Enable OAuth Settings) section, enable OAuth and add the scope that allows managing user data through the API. A Callback URL is required by the form, but our jobs never use it because no browser is involved. Any valid HTTPS address will do.</w:t>
+      </w:r>
+    </w:p>
+    <w:p>
+      <w:r>
+        <w:rPr>
+          <w:b/>
+          <w:bCs/>
+        </w:rPr>
+        <w:t xml:space="preserve">[ Screenshot: OAuth settings and selected scope ]</w:t>
+      </w:r>
+    </w:p>
+    <w:p/>
+    <w:p>
+      <w:r>
+        <w:rPr>
+          <w:b/>
+          <w:bCs/>
+        </w:rPr>
+        <w:t xml:space="preserve">Step 3 - Enable the Client Credentials flow and set the Run As user</w:t>
+      </w:r>
+    </w:p>
+    <w:p>
+      <w:r>
+        <w:t xml:space="preserve">In the app’s Policies, enable the Client Credentials flow and choose a Run As user. This is the setting that allows a program to log in with no person involved.</w:t>
+      </w:r>
+    </w:p>
+    <w:p>
+      <w:r>
+        <w:rPr>
+          <w:b/>
+          <w:bCs/>
+        </w:rPr>
+        <w:t xml:space="preserve">Note: </w:t>
+      </w:r>
+      <w:r>
+        <w:t xml:space="preserve">The Run As user decides what the jobs can do. Every record read, changed or deleted is handled as that user, so if it cannot see an object, neither can the job. Give it what the jobs need and nothing more.</w:t>
+      </w:r>
+    </w:p>
+    <w:p>
+      <w:r>
+        <w:rPr>
+          <w:b/>
+          <w:bCs/>
+        </w:rPr>
+        <w:t xml:space="preserve">[ Screenshot: Client Credentials enabled with a Run As user ]</w:t>
+      </w:r>
+    </w:p>
+    <w:p/>
+    <w:p>
+      <w:r>
+        <w:rPr>
+          <w:b/>
+          <w:bCs/>
+        </w:rPr>
+        <w:t xml:space="preserve">Step 4 - Collect the three values you need</w:t>
       </w:r>
     </w:p>
     <w:tbl>
@@ -1561,7 +701,7 @@
                 <w:b/>
                 <w:bCs/>
               </w:rPr>
-              <w:t xml:space="preserve">Key</w:t>
+              <w:t xml:space="preserve">Value</w:t>
             </w:r>
           </w:p>
         </w:tc>
@@ -1587,7 +727,105 @@
                 <w:b/>
                 <w:bCs/>
               </w:rPr>
-              <w:t xml:space="preserve">Value</w:t>
+              <w:t xml:space="preserve">Where to get it</w:t>
+            </w:r>
+          </w:p>
+        </w:tc>
+      </w:tr>
+      <w:tr>
+        <w:tc>
+          <w:tcPr>
+            <w:tcW w:w="0" w:type="auto"/>
+            <w:tcBorders>
+              <w:top w:val="single" w:sz="6" w:space="0" w:color="auto"/>
+              <w:left w:val="single" w:sz="6" w:space="0" w:color="auto"/>
+              <w:bottom w:val="single" w:sz="6" w:space="0" w:color="auto"/>
+              <w:right w:val="single" w:sz="6" w:space="0" w:color="auto"/>
+            </w:tcBorders>
+            <w:tcMar>
+              <w:top w:w="105" w:type="dxa"/>
+              <w:left w:w="150" w:type="dxa"/>
+              <w:bottom w:w="105" w:type="dxa"/>
+              <w:right w:w="150" w:type="dxa"/>
+            </w:tcMar>
+          </w:tcPr>
+          <w:p>
+            <w:r>
+              <w:rPr>
+                <w:rFonts w:ascii="Consolas" w:hAnsi="Consolas"/>
+              </w:rPr>
+              <w:t xml:space="preserve">clientId</w:t>
+            </w:r>
+          </w:p>
+        </w:tc>
+        <w:tc>
+          <w:tcPr>
+            <w:tcW w:w="0" w:type="auto"/>
+            <w:tcBorders>
+              <w:top w:val="single" w:sz="6" w:space="0" w:color="auto"/>
+              <w:left w:val="single" w:sz="6" w:space="0" w:color="auto"/>
+              <w:bottom w:val="single" w:sz="6" w:space="0" w:color="auto"/>
+              <w:right w:val="single" w:sz="6" w:space="0" w:color="auto"/>
+            </w:tcBorders>
+            <w:tcMar>
+              <w:top w:w="105" w:type="dxa"/>
+              <w:left w:w="150" w:type="dxa"/>
+              <w:bottom w:w="105" w:type="dxa"/>
+              <w:right w:w="150" w:type="dxa"/>
+            </w:tcMar>
+          </w:tcPr>
+          <w:p>
+            <w:r>
+              <w:t xml:space="preserve">The app’s Consumer Key. Settings → OAuth → reveal the key and secret.</w:t>
+            </w:r>
+          </w:p>
+        </w:tc>
+      </w:tr>
+      <w:tr>
+        <w:tc>
+          <w:tcPr>
+            <w:tcW w:w="0" w:type="auto"/>
+            <w:tcBorders>
+              <w:top w:val="single" w:sz="6" w:space="0" w:color="auto"/>
+              <w:left w:val="single" w:sz="6" w:space="0" w:color="auto"/>
+              <w:bottom w:val="single" w:sz="6" w:space="0" w:color="auto"/>
+              <w:right w:val="single" w:sz="6" w:space="0" w:color="auto"/>
+            </w:tcBorders>
+            <w:tcMar>
+              <w:top w:w="105" w:type="dxa"/>
+              <w:left w:w="150" w:type="dxa"/>
+              <w:bottom w:w="105" w:type="dxa"/>
+              <w:right w:w="150" w:type="dxa"/>
+            </w:tcMar>
+          </w:tcPr>
+          <w:p>
+            <w:r>
+              <w:rPr>
+                <w:rFonts w:ascii="Consolas" w:hAnsi="Consolas"/>
+              </w:rPr>
+              <w:t xml:space="preserve">clientSecret</w:t>
+            </w:r>
+          </w:p>
+        </w:tc>
+        <w:tc>
+          <w:tcPr>
+            <w:tcW w:w="0" w:type="auto"/>
+            <w:tcBorders>
+              <w:top w:val="single" w:sz="6" w:space="0" w:color="auto"/>
+              <w:left w:val="single" w:sz="6" w:space="0" w:color="auto"/>
+              <w:bottom w:val="single" w:sz="6" w:space="0" w:color="auto"/>
+              <w:right w:val="single" w:sz="6" w:space="0" w:color="auto"/>
+            </w:tcBorders>
+            <w:tcMar>
+              <w:top w:w="105" w:type="dxa"/>
+              <w:left w:w="150" w:type="dxa"/>
+              <w:bottom w:w="105" w:type="dxa"/>
+              <w:right w:w="150" w:type="dxa"/>
+            </w:tcMar>
+          </w:tcPr>
+          <w:p>
+            <w:r>
+              <w:t xml:space="preserve">The app’s Consumer Secret, revealed at the same place.</w:t>
             </w:r>
           </w:p>
         </w:tc>
@@ -1636,154 +874,7 @@
           </w:tcPr>
           <w:p>
             <w:r>
-              <w:t xml:space="preserve">The org’s My Domain URL. Use the sandbox URL while testing.</w:t>
-            </w:r>
-          </w:p>
-        </w:tc>
-      </w:tr>
-      <w:tr>
-        <w:tc>
-          <w:tcPr>
-            <w:tcW w:w="0" w:type="auto"/>
-            <w:tcBorders>
-              <w:top w:val="single" w:sz="6" w:space="0" w:color="auto"/>
-              <w:left w:val="single" w:sz="6" w:space="0" w:color="auto"/>
-              <w:bottom w:val="single" w:sz="6" w:space="0" w:color="auto"/>
-              <w:right w:val="single" w:sz="6" w:space="0" w:color="auto"/>
-            </w:tcBorders>
-            <w:tcMar>
-              <w:top w:w="105" w:type="dxa"/>
-              <w:left w:w="150" w:type="dxa"/>
-              <w:bottom w:w="105" w:type="dxa"/>
-              <w:right w:w="150" w:type="dxa"/>
-            </w:tcMar>
-          </w:tcPr>
-          <w:p>
-            <w:r>
-              <w:rPr>
-                <w:rFonts w:ascii="Consolas" w:hAnsi="Consolas"/>
-              </w:rPr>
-              <w:t xml:space="preserve">clientId</w:t>
-            </w:r>
-          </w:p>
-        </w:tc>
-        <w:tc>
-          <w:tcPr>
-            <w:tcW w:w="0" w:type="auto"/>
-            <w:tcBorders>
-              <w:top w:val="single" w:sz="6" w:space="0" w:color="auto"/>
-              <w:left w:val="single" w:sz="6" w:space="0" w:color="auto"/>
-              <w:bottom w:val="single" w:sz="6" w:space="0" w:color="auto"/>
-              <w:right w:val="single" w:sz="6" w:space="0" w:color="auto"/>
-            </w:tcBorders>
-            <w:tcMar>
-              <w:top w:w="105" w:type="dxa"/>
-              <w:left w:w="150" w:type="dxa"/>
-              <w:bottom w:w="105" w:type="dxa"/>
-              <w:right w:w="150" w:type="dxa"/>
-            </w:tcMar>
-          </w:tcPr>
-          <w:p>
-            <w:r>
-              <w:t xml:space="preserve">Consumer Key from the External Client App.</w:t>
-            </w:r>
-          </w:p>
-        </w:tc>
-      </w:tr>
-      <w:tr>
-        <w:tc>
-          <w:tcPr>
-            <w:tcW w:w="0" w:type="auto"/>
-            <w:tcBorders>
-              <w:top w:val="single" w:sz="6" w:space="0" w:color="auto"/>
-              <w:left w:val="single" w:sz="6" w:space="0" w:color="auto"/>
-              <w:bottom w:val="single" w:sz="6" w:space="0" w:color="auto"/>
-              <w:right w:val="single" w:sz="6" w:space="0" w:color="auto"/>
-            </w:tcBorders>
-            <w:tcMar>
-              <w:top w:w="105" w:type="dxa"/>
-              <w:left w:w="150" w:type="dxa"/>
-              <w:bottom w:w="105" w:type="dxa"/>
-              <w:right w:w="150" w:type="dxa"/>
-            </w:tcMar>
-          </w:tcPr>
-          <w:p>
-            <w:r>
-              <w:rPr>
-                <w:rFonts w:ascii="Consolas" w:hAnsi="Consolas"/>
-              </w:rPr>
-              <w:t xml:space="preserve">clientSecret</w:t>
-            </w:r>
-          </w:p>
-        </w:tc>
-        <w:tc>
-          <w:tcPr>
-            <w:tcW w:w="0" w:type="auto"/>
-            <w:tcBorders>
-              <w:top w:val="single" w:sz="6" w:space="0" w:color="auto"/>
-              <w:left w:val="single" w:sz="6" w:space="0" w:color="auto"/>
-              <w:bottom w:val="single" w:sz="6" w:space="0" w:color="auto"/>
-              <w:right w:val="single" w:sz="6" w:space="0" w:color="auto"/>
-            </w:tcBorders>
-            <w:tcMar>
-              <w:top w:w="105" w:type="dxa"/>
-              <w:left w:w="150" w:type="dxa"/>
-              <w:bottom w:w="105" w:type="dxa"/>
-              <w:right w:w="150" w:type="dxa"/>
-            </w:tcMar>
-          </w:tcPr>
-          <w:p>
-            <w:r>
-              <w:t xml:space="preserve">Consumer Secret from the External Client App.</w:t>
-            </w:r>
-          </w:p>
-        </w:tc>
-      </w:tr>
-      <w:tr>
-        <w:tc>
-          <w:tcPr>
-            <w:tcW w:w="0" w:type="auto"/>
-            <w:tcBorders>
-              <w:top w:val="single" w:sz="6" w:space="0" w:color="auto"/>
-              <w:left w:val="single" w:sz="6" w:space="0" w:color="auto"/>
-              <w:bottom w:val="single" w:sz="6" w:space="0" w:color="auto"/>
-              <w:right w:val="single" w:sz="6" w:space="0" w:color="auto"/>
-            </w:tcBorders>
-            <w:tcMar>
-              <w:top w:w="105" w:type="dxa"/>
-              <w:left w:w="150" w:type="dxa"/>
-              <w:bottom w:w="105" w:type="dxa"/>
-              <w:right w:w="150" w:type="dxa"/>
-            </w:tcMar>
-          </w:tcPr>
-          <w:p>
-            <w:r>
-              <w:rPr>
-                <w:rFonts w:ascii="Consolas" w:hAnsi="Consolas"/>
-              </w:rPr>
-              <w:t xml:space="preserve">org</w:t>
-            </w:r>
-          </w:p>
-        </w:tc>
-        <w:tc>
-          <w:tcPr>
-            <w:tcW w:w="0" w:type="auto"/>
-            <w:tcBorders>
-              <w:top w:val="single" w:sz="6" w:space="0" w:color="auto"/>
-              <w:left w:val="single" w:sz="6" w:space="0" w:color="auto"/>
-              <w:bottom w:val="single" w:sz="6" w:space="0" w:color="auto"/>
-              <w:right w:val="single" w:sz="6" w:space="0" w:color="auto"/>
-            </w:tcBorders>
-            <w:tcMar>
-              <w:top w:w="105" w:type="dxa"/>
-              <w:left w:w="150" w:type="dxa"/>
-              <w:bottom w:w="105" w:type="dxa"/>
-              <w:right w:w="150" w:type="dxa"/>
-            </w:tcMar>
-          </w:tcPr>
-          <w:p>
-            <w:r>
-              <w:t xml:space="preserve">The alias every Salesforce CLI command in the run targets.</w:t>
+              <w:t xml:space="preserve">The org’s My Domain address, shown in the browser address bar when logged in. For example https://mycompany--uat.sandbox.my.salesforce.com</w:t>
             </w:r>
           </w:p>
         </w:tc>
@@ -1791,7 +882,62 @@
     </w:tbl>
     <w:p>
       <w:r>
-        <w:t xml:space="preserve">For example:</w:t>
+        <w:rPr>
+          <w:b/>
+          <w:bCs/>
+        </w:rPr>
+        <w:t xml:space="preserve">Note: </w:t>
+      </w:r>
+      <w:r>
+        <w:t xml:space="preserve">Use the sandbox address while testing. The general login address does not work with the Client Credentials flow. Treat the Consumer Secret like a password: do not email it or put it in a shared document.</w:t>
+      </w:r>
+    </w:p>
+    <w:p/>
+    <w:p>
+      <w:pPr>
+        <w:rPr>
+          <w:b/>
+          <w:bCs/>
+        </w:rPr>
+      </w:pPr>
+      <w:r>
+        <w:rPr>
+          <w:b/>
+          <w:bCs/>
+        </w:rPr>
+        <w:t xml:space="preserve">Part 2 - Install the Salesforce CLI on the UAT server</w:t>
+      </w:r>
+    </w:p>
+    <w:p>
+      <w:r>
+        <w:rPr>
+          <w:b/>
+          <w:bCs/>
+        </w:rPr>
+        <w:t xml:space="preserve">Goal: </w:t>
+      </w:r>
+      <w:r>
+        <w:t xml:space="preserve">the sf command works on the server, both for you and for the account that runs the scheduled jobs.</w:t>
+      </w:r>
+    </w:p>
+    <w:p>
+      <w:r>
+        <w:t xml:space="preserve">The jobs send every query and every data load through the Salesforce CLI, so nothing can be tested until this is in place.</w:t>
+      </w:r>
+    </w:p>
+    <w:p/>
+    <w:p>
+      <w:r>
+        <w:rPr>
+          <w:b/>
+          <w:bCs/>
+        </w:rPr>
+        <w:t xml:space="preserve">Step 1 - Install it</w:t>
+      </w:r>
+    </w:p>
+    <w:p>
+      <w:r>
+        <w:t xml:space="preserve">Download the Windows installer and run it as administrator, installing for the whole machine:</w:t>
       </w:r>
     </w:p>
     <w:p>
@@ -1799,6 +945,174 @@
         <w:rPr>
           <w:rFonts w:ascii="Consolas" w:hAnsi="Consolas"/>
         </w:rPr>
+        <w:t xml:space="preserve">https://developer.salesforce.com/tools/salesforcecli</w:t>
+      </w:r>
+    </w:p>
+    <w:p>
+      <w:r>
+        <w:t xml:space="preserve">Use the installer rather than npm. It includes everything it needs and adds itself to the system PATH. If the server has no internet access, download it elsewhere and copy it across. The CLI only needs to reach Salesforce when it runs, not the wider internet.</w:t>
+      </w:r>
+    </w:p>
+    <w:p/>
+    <w:p>
+      <w:r>
+        <w:rPr>
+          <w:b/>
+          <w:bCs/>
+        </w:rPr>
+        <w:t xml:space="preserve">Step 2 - Confirm it responds</w:t>
+      </w:r>
+    </w:p>
+    <w:p>
+      <w:r>
+        <w:t xml:space="preserve">Open a new Command Prompt, since an already open one will not see the new install, and run:</w:t>
+      </w:r>
+    </w:p>
+    <w:p>
+      <w:r>
+        <w:rPr>
+          <w:rFonts w:ascii="Consolas" w:hAnsi="Consolas"/>
+        </w:rPr>
+        <w:t xml:space="preserve">sf --version</w:t>
+      </w:r>
+    </w:p>
+    <w:p/>
+    <w:p>
+      <w:r>
+        <w:rPr>
+          <w:b/>
+          <w:bCs/>
+        </w:rPr>
+        <w:t xml:space="preserve">Step 3 - Confirm the version has the commands the jobs use</w:t>
+      </w:r>
+    </w:p>
+    <w:p>
+      <w:r>
+        <w:t xml:space="preserve">The jobs use seven commands. Run each with --help. If any is not recognised, the installed version is too old and needs updating.</w:t>
+      </w:r>
+    </w:p>
+    <w:p>
+      <w:r>
+        <w:rPr>
+          <w:rFonts w:ascii="Consolas" w:hAnsi="Consolas"/>
+        </w:rPr>
+        <w:t xml:space="preserve">sf org login access-token       sf data upsert bulk</w:t>
+      </w:r>
+    </w:p>
+    <w:p>
+      <w:r>
+        <w:rPr>
+          <w:rFonts w:ascii="Consolas" w:hAnsi="Consolas"/>
+        </w:rPr>
+        <w:t xml:space="preserve">sf data query                   sf data delete bulk</w:t>
+      </w:r>
+    </w:p>
+    <w:p>
+      <w:r>
+        <w:rPr>
+          <w:rFonts w:ascii="Consolas" w:hAnsi="Consolas"/>
+        </w:rPr>
+        <w:t xml:space="preserve">sf data import bulk             sf data bulk results</w:t>
+      </w:r>
+    </w:p>
+    <w:p>
+      <w:r>
+        <w:rPr>
+          <w:rFonts w:ascii="Consolas" w:hAnsi="Consolas"/>
+        </w:rPr>
+        <w:t xml:space="preserve">sf data update bulk</w:t>
+      </w:r>
+    </w:p>
+    <w:p>
+      <w:r>
+        <w:rPr>
+          <w:b/>
+          <w:bCs/>
+        </w:rPr>
+        <w:t xml:space="preserve">Note: </w:t>
+      </w:r>
+      <w:r>
+        <w:t xml:space="preserve">These commands were added to the CLI over several releases, so an older version can be missing one. Checking now takes a minute. Finding out mid run does not.</w:t>
+      </w:r>
+    </w:p>
+    <w:p/>
+    <w:p>
+      <w:r>
+        <w:rPr>
+          <w:b/>
+          <w:bCs/>
+        </w:rPr>
+        <w:t xml:space="preserve">Step 4 - Confirm it works for the scheduled job account</w:t>
+      </w:r>
+    </w:p>
+    <w:p>
+      <w:r>
+        <w:t xml:space="preserve">This step is skipped often and causes a confusing failure later, where the job runs perfectly by hand but fails every night. The cause is that the scheduled task runs as a different Windows account, which cannot find the CLI. Run sf --version as that account too.</w:t>
+      </w:r>
+    </w:p>
+    <w:p>
+      <w:r>
+        <w:rPr>
+          <w:b/>
+          <w:bCs/>
+        </w:rPr>
+        <w:t xml:space="preserve">Note: </w:t>
+      </w:r>
+      <w:r>
+        <w:t xml:space="preserve">The CLI also saves its login inside that account’s Windows profile. A service account that has never logged in may not have one yet. Ask your Windows administrator to check if the version command works but the login still fails.</w:t>
+      </w:r>
+    </w:p>
+    <w:p/>
+    <w:p>
+      <w:pPr>
+        <w:rPr>
+          <w:b/>
+          <w:bCs/>
+        </w:rPr>
+      </w:pPr>
+      <w:r>
+        <w:rPr>
+          <w:b/>
+          <w:bCs/>
+        </w:rPr>
+        <w:t xml:space="preserve">Part 3 - Create the credentials file</w:t>
+      </w:r>
+    </w:p>
+    <w:p>
+      <w:r>
+        <w:rPr>
+          <w:b/>
+          <w:bCs/>
+        </w:rPr>
+        <w:t xml:space="preserve">Goal: </w:t>
+      </w:r>
+      <w:r>
+        <w:t xml:space="preserve">one file on the server holds the login for every job.</w:t>
+      </w:r>
+    </w:p>
+    <w:p/>
+    <w:p>
+      <w:r>
+        <w:rPr>
+          <w:b/>
+          <w:bCs/>
+        </w:rPr>
+        <w:t xml:space="preserve">Step 1 - Create the file</w:t>
+      </w:r>
+    </w:p>
+    <w:p>
+      <w:r>
+        <w:rPr>
+          <w:rFonts w:ascii="Consolas" w:hAnsi="Consolas"/>
+        </w:rPr>
+        <w:t xml:space="preserve">...\NLG\Config\clientcreds.json</w:t>
+      </w:r>
+    </w:p>
+    <w:p>
+      <w:r>
+        <w:rPr>
+          <w:rFonts w:ascii="Consolas" w:hAnsi="Consolas"/>
+        </w:rPr>
         <w:t xml:space="preserve">{</w:t>
       </w:r>
     </w:p>
@@ -1807,7 +1121,7 @@
         <w:rPr>
           <w:rFonts w:ascii="Consolas" w:hAnsi="Consolas"/>
         </w:rPr>
-        <w:t xml:space="preserve">    "domain":       "https://&lt;my-domain&gt;.sandbox.my.salesforce.com",</w:t>
+        <w:t xml:space="preserve">    "domain":       "https://mycompany--uat.sandbox.my.salesforce.com",</w:t>
       </w:r>
     </w:p>
     <w:p>
@@ -1831,7 +1145,7 @@
         <w:rPr>
           <w:rFonts w:ascii="Consolas" w:hAnsi="Consolas"/>
         </w:rPr>
-        <w:t xml:space="preserve">    "org":          "&lt;alias&gt;"</w:t>
+        <w:t xml:space="preserve">    "org":          "uatorg"</w:t>
       </w:r>
     </w:p>
     <w:p>
@@ -1844,6 +1158,11 @@
     </w:p>
     <w:p>
       <w:r>
+        <w:t xml:space="preserve">The org value is a short nickname of your choosing. The jobs use it to refer to the org, and it is printed on screen when a run starts.</w:t>
+      </w:r>
+    </w:p>
+    <w:p>
+      <w:r>
         <w:rPr>
           <w:b/>
           <w:bCs/>
@@ -1851,7 +1170,139 @@
         <w:t xml:space="preserve">Note: </w:t>
       </w:r>
       <w:r>
-        <w:t xml:space="preserve">This is the only file edited to move the jobs between orgs. The bean files and the SDL mapping files carry no org information at all.</w:t>
+        <w:t xml:space="preserve">It goes in the NLG Config folder, not inside an individual job’s Config folder. Every job shares this one file. Putting it in the wrong place produces the error that the target org is unknown.</w:t>
+      </w:r>
+    </w:p>
+    <w:p/>
+    <w:p>
+      <w:r>
+        <w:rPr>
+          <w:b/>
+          <w:bCs/>
+        </w:rPr>
+        <w:t xml:space="preserve">Step 2 - Restrict who can read it</w:t>
+      </w:r>
+    </w:p>
+    <w:p>
+      <w:r>
+        <w:t xml:space="preserve">The file holds a live secret in plain text. Limit it to the account that runs the jobs and to administrators.</w:t>
+      </w:r>
+    </w:p>
+    <w:p/>
+    <w:p>
+      <w:r>
+        <w:rPr>
+          <w:b/>
+          <w:bCs/>
+        </w:rPr>
+        <w:t xml:space="preserve">Step 3 - Remember this is the only file that changes between orgs</w:t>
+      </w:r>
+    </w:p>
+    <w:p>
+      <w:r>
+        <w:t xml:space="preserve">Moving from UAT to production means editing this one file. The bean files and SDL files hold no org information at all.</w:t>
+      </w:r>
+    </w:p>
+    <w:p/>
+    <w:p>
+      <w:pPr>
+        <w:rPr>
+          <w:b/>
+          <w:bCs/>
+        </w:rPr>
+      </w:pPr>
+      <w:r>
+        <w:rPr>
+          <w:b/>
+          <w:bCs/>
+        </w:rPr>
+        <w:t xml:space="preserve">Part 4 - Update the bean file and test</w:t>
+      </w:r>
+    </w:p>
+    <w:p>
+      <w:r>
+        <w:rPr>
+          <w:b/>
+          <w:bCs/>
+        </w:rPr>
+        <w:t xml:space="preserve">Goal: </w:t>
+      </w:r>
+      <w:r>
+        <w:t xml:space="preserve">the jobs run exactly as before, using the new login.</w:t>
+      </w:r>
+    </w:p>
+    <w:p/>
+    <w:p>
+      <w:r>
+        <w:rPr>
+          <w:b/>
+          <w:bCs/>
+        </w:rPr>
+        <w:t xml:space="preserve">Step 1 - Back up the bean file</w:t>
+      </w:r>
+    </w:p>
+    <w:p>
+      <w:r>
+        <w:t xml:space="preserve">Keep a copy of the original before editing, so it can be put back if needed.</w:t>
+      </w:r>
+    </w:p>
+    <w:p/>
+    <w:p>
+      <w:r>
+        <w:rPr>
+          <w:b/>
+          <w:bCs/>
+        </w:rPr>
+        <w:t xml:space="preserve">Step 2 - Remove the four old login lines</w:t>
+      </w:r>
+    </w:p>
+    <w:p>
+      <w:r>
+        <w:t xml:space="preserve">Each job in the bean file carries these four entries. Delete them from every job, then save.</w:t>
+      </w:r>
+    </w:p>
+    <w:p>
+      <w:r>
+        <w:rPr>
+          <w:rFonts w:ascii="Consolas" w:hAnsi="Consolas"/>
+        </w:rPr>
+        <w:t xml:space="preserve">sfdc.endpoint</w:t>
+      </w:r>
+    </w:p>
+    <w:p>
+      <w:r>
+        <w:rPr>
+          <w:rFonts w:ascii="Consolas" w:hAnsi="Consolas"/>
+        </w:rPr>
+        <w:t xml:space="preserve">sfdc.username</w:t>
+      </w:r>
+    </w:p>
+    <w:p>
+      <w:r>
+        <w:rPr>
+          <w:rFonts w:ascii="Consolas" w:hAnsi="Consolas"/>
+        </w:rPr>
+        <w:t xml:space="preserve">sfdc.password</w:t>
+      </w:r>
+    </w:p>
+    <w:p>
+      <w:r>
+        <w:rPr>
+          <w:rFonts w:ascii="Consolas" w:hAnsi="Consolas"/>
+        </w:rPr>
+        <w:t xml:space="preserve">process.encryptionKeyFile</w:t>
+      </w:r>
+    </w:p>
+    <w:p>
+      <w:r>
+        <w:rPr>
+          <w:b/>
+          <w:bCs/>
+        </w:rPr>
+        <w:t xml:space="preserve">Change nothing else. </w:t>
+      </w:r>
+      <w:r>
+        <w:t xml:space="preserve">The object, the operation, the file paths, the mapping file, the batch size, the timeout and the timezone are all still used and must stay exactly as they are.</w:t>
       </w:r>
     </w:p>
     <w:p>
@@ -1863,7 +1314,7 @@
         <w:t xml:space="preserve">Note: </w:t>
       </w:r>
       <w:r>
-        <w:t xml:space="preserve">The file holds a live client secret in clear text, so the Windows permissions on the Config folder are what protect it. Restrict it to the account the scheduled jobs run as.</w:t>
+        <w:t xml:space="preserve">Those four lines were the only reason the encrypted password and the encryption key file existed. Once every job is moved over, both can be retired.</w:t>
       </w:r>
     </w:p>
     <w:p/>
@@ -1873,49 +1324,12 @@
           <w:b/>
           <w:bCs/>
         </w:rPr>
-        <w:t xml:space="preserve">Step 3 - Remove the old login entries from the bean file</w:t>
-      </w:r>
-    </w:p>
-    <w:p>
-      <w:r>
-        <w:t xml:space="preserve">Each bean previously carried the login inline, repeated in every bean in every job folder. Exactly four entries are removed from each bean:</w:t>
-      </w:r>
-    </w:p>
-    <w:p>
-      <w:r>
-        <w:rPr>
-          <w:rFonts w:ascii="Consolas" w:hAnsi="Consolas"/>
-        </w:rPr>
-        <w:t xml:space="preserve">sfdc.endpoint</w:t>
-      </w:r>
-    </w:p>
-    <w:p>
-      <w:r>
-        <w:rPr>
-          <w:rFonts w:ascii="Consolas" w:hAnsi="Consolas"/>
-        </w:rPr>
-        <w:t xml:space="preserve">sfdc.username</w:t>
-      </w:r>
-    </w:p>
-    <w:p>
-      <w:r>
-        <w:rPr>
-          <w:rFonts w:ascii="Consolas" w:hAnsi="Consolas"/>
-        </w:rPr>
-        <w:t xml:space="preserve">sfdc.password</w:t>
-      </w:r>
-    </w:p>
-    <w:p>
-      <w:r>
-        <w:rPr>
-          <w:rFonts w:ascii="Consolas" w:hAnsi="Consolas"/>
-        </w:rPr>
-        <w:t xml:space="preserve">process.encryptionKeyFile</w:t>
-      </w:r>
-    </w:p>
-    <w:p>
-      <w:r>
-        <w:t xml:space="preserve">Nothing else in the bean changes. The entity, the operation, the external id field, the source and output file paths, the mapping file, the batch size, the timeout and the timezone are all left exactly as they are.</w:t>
+        <w:t xml:space="preserve">Step 3 - Test with a read only job first</w:t>
+      </w:r>
+    </w:p>
+    <w:p>
+      <w:r>
+        <w:t xml:space="preserve">Start with a job that only reads data out to a file, never one that changes or deletes records, so a mistake cannot harm anything. Check the org name printed at the start is the one you expect before letting it continue.</w:t>
       </w:r>
     </w:p>
     <w:p>
@@ -1927,7 +1341,7 @@
         <w:t xml:space="preserve">Note: </w:t>
       </w:r>
       <w:r>
-        <w:t xml:space="preserve">Because the login is no longer in the bean, the encrypted password and the encryption key file it depended on are no longer read by anything. Once every job has been migrated these can be retired along with the integration user’s password.</w:t>
+        <w:t xml:space="preserve">The screen stays blank while a job runs. That is normal, because the work happens inside Salesforce. Do not press Ctrl and C, which stops the job halfway and leaves a part written file.</w:t>
       </w:r>
     </w:p>
     <w:p/>
@@ -1937,12 +1351,33 @@
           <w:b/>
           <w:bCs/>
         </w:rPr>
-        <w:t xml:space="preserve">Step 4 - How the authorization works</w:t>
-      </w:r>
-    </w:p>
-    <w:p>
-      <w:r>
-        <w:t xml:space="preserve">When a batch file starts, it performs the following sequence before any job runs:</w:t>
+        <w:t xml:space="preserve">Step 4 - Compare against a previous run</w:t>
+      </w:r>
+    </w:p>
+    <w:p>
+      <w:r>
+        <w:t xml:space="preserve">The record counts in the output file and the log should match what the same job produced before the change. If they do, the login works and the job is behaving as before.</w:t>
+      </w:r>
+    </w:p>
+    <w:p/>
+    <w:p>
+      <w:pPr>
+        <w:rPr>
+          <w:b/>
+          <w:bCs/>
+        </w:rPr>
+      </w:pPr>
+      <w:r>
+        <w:rPr>
+          <w:b/>
+          <w:bCs/>
+        </w:rPr>
+        <w:t xml:space="preserve">How the login works</w:t>
+      </w:r>
+    </w:p>
+    <w:p>
+      <w:r>
+        <w:t xml:space="preserve">Useful when something goes wrong. Every batch file does this once, before any data is touched:</w:t>
       </w:r>
     </w:p>
     <w:tbl>
@@ -1984,7 +1419,7 @@
                 <w:b/>
                 <w:bCs/>
               </w:rPr>
-              <w:t xml:space="preserve">#</w:t>
+              <w:t xml:space="preserve">Step</w:t>
             </w:r>
           </w:p>
         </w:tc>
@@ -2056,7 +1491,7 @@
           </w:tcPr>
           <w:p>
             <w:r>
-              <w:t xml:space="preserve">The batch file locates clientcreds.json in the Config folder and reads the org alias from it. The target org is printed to the screen and written to the log before anything is queried, loaded or deleted.</w:t>
+              <w:t xml:space="preserve">Finds clientcreds.json, reads the org nickname, and prints it on screen and into the log.</w:t>
             </w:r>
           </w:p>
         </w:tc>
@@ -2102,17 +1537,7 @@
           </w:tcPr>
           <w:p>
             <w:r>
-              <w:t xml:space="preserve">A single HTTPS POST is made with curl.exe to the token endpoint:</w:t>
-            </w:r>
-          </w:p>
-          <w:p>
-            <w:r>
-              <w:t xml:space="preserve">&lt;domain&gt;/services/oauth2/token</w:t>
-            </w:r>
-          </w:p>
-          <w:p>
-            <w:r>
-              <w:t xml:space="preserve">The form body carries grant_type=client_credentials together with the client id and the client secret.</w:t>
+              <w:t xml:space="preserve">Sends the Client ID and Secret to the org address, to /services/oauth2/token.</w:t>
             </w:r>
           </w:p>
         </w:tc>
@@ -2158,7 +1583,7 @@
           </w:tcPr>
           <w:p>
             <w:r>
-              <w:t xml:space="preserve">Salesforce validates the app and the Run As user, and returns a JSON response containing an access_token and the instance_url of the org.</w:t>
+              <w:t xml:space="preserve">Salesforce checks the app and the Run As user and returns an access token, which is a temporary pass.</w:t>
             </w:r>
           </w:p>
         </w:tc>
@@ -2204,17 +1629,7 @@
           </w:tcPr>
           <w:p>
             <w:r>
-              <w:t xml:space="preserve">The access token is handed to the Salesforce CLI through an environment variable, never on a command line, using:</w:t>
-            </w:r>
-          </w:p>
-          <w:p>
-            <w:r>
-              <w:t xml:space="preserve">sf org login access-token -r &lt;instance_url&gt; -a &lt;alias&gt; -p</w:t>
-            </w:r>
-          </w:p>
-          <w:p>
-            <w:r>
-              <w:t xml:space="preserve">The -p switch persists the login under the alias.</w:t>
+              <w:t xml:space="preserve">The token is handed to the Salesforce CLI and saved under the org nickname.</w:t>
             </w:r>
           </w:p>
         </w:tc>
@@ -2260,18 +1675,13 @@
           </w:tcPr>
           <w:p>
             <w:r>
-              <w:t xml:space="preserve">Every job in the run then executes against --target-org &lt;alias&gt;. No further login takes place.</w:t>
+              <w:t xml:space="preserve">Every job in that run uses it. No further logging in happens.</w:t>
             </w:r>
           </w:p>
         </w:tc>
       </w:tr>
     </w:tbl>
     <w:p/>
-    <w:p>
-      <w:r>
-        <w:t xml:space="preserve">Three properties of this flow are worth being explicit about:</w:t>
-      </w:r>
-    </w:p>
     <w:p>
       <w:pPr>
         <w:numPr>
@@ -2281,7 +1691,7 @@
         <w:ind w:left="720"/>
       </w:pPr>
       <w:r>
-        <w:t xml:space="preserve">One token per run. The token is fetched once, before the first job starts, and every job in that run reuses it. The only exception is a session that expires part way through a long run, which triggers exactly one replacement fetch and one retry of the job that hit it.</w:t>
+        <w:t xml:space="preserve">One login per run, however many jobs run. The exception is a run long enough for the pass to expire partway through, which quietly fetches a fresh one and retries that job.</w:t>
       </w:r>
     </w:p>
     <w:p>
@@ -2293,7 +1703,7 @@
         <w:ind w:left="720"/>
       </w:pPr>
       <w:r>
-        <w:t xml:space="preserve">The token response file is deleted on every exit path, success and failure alike, because it holds a live bearer token in clear text.</w:t>
+        <w:t xml:space="preserve">The file holding the pass is deleted as soon as it is used, whether the run succeeded or failed.</w:t>
       </w:r>
     </w:p>
     <w:p>
@@ -2305,33 +1715,464 @@
         <w:ind w:left="720"/>
       </w:pPr>
       <w:r>
-        <w:t xml:space="preserve">There is no refresh token and no password. The client id and client secret are the only long-lived credentials, and they live in one file rather than in every bean.</w:t>
+        <w:t xml:space="preserve">No password expires any more. The Client ID and Secret are the only long lived values, and they sit in one file instead of being repeated in every bean file.</w:t>
       </w:r>
     </w:p>
     <w:p/>
     <w:p>
-      <w:r>
-        <w:rPr>
-          <w:b/>
-          <w:bCs/>
-        </w:rPr>
-        <w:t xml:space="preserve">Step 5 - Confirm the target org before running</w:t>
-      </w:r>
-    </w:p>
-    <w:p>
-      <w:r>
-        <w:t xml:space="preserve">Each batch file prints the target org alias on screen and to its log before it does any work. Read it. Because a single credentials file decides which org every job on the box writes to, this line is the check that a run is pointed where it is meant to be.</w:t>
-      </w:r>
-    </w:p>
-    <w:p>
-      <w:r>
-        <w:rPr>
-          <w:b/>
-          <w:bCs/>
-        </w:rPr>
-        <w:t xml:space="preserve">[ Screenshot: Target org banner printed at the start of a run ]</w:t>
-      </w:r>
-    </w:p>
+      <w:pPr>
+        <w:rPr>
+          <w:b/>
+          <w:bCs/>
+        </w:rPr>
+      </w:pPr>
+      <w:r>
+        <w:rPr>
+          <w:b/>
+          <w:bCs/>
+        </w:rPr>
+        <w:t xml:space="preserve">What did not change</w:t>
+      </w:r>
+    </w:p>
+    <w:tbl>
+      <w:tblPr>
+        <w:tblW w:w="0" w:type="auto"/>
+        <w:tblCellMar>
+          <w:left w:w="0" w:type="dxa"/>
+          <w:right w:w="0" w:type="dxa"/>
+        </w:tblCellMar>
+        <w:tblLook w:val="04A0" w:firstRow="1" w:lastRow="0" w:firstColumn="1" w:lastColumn="0" w:noHBand="0" w:noVBand="1"/>
+      </w:tblPr>
+      <w:tblGrid>
+        <w:gridCol w:w="4200"/>
+        <w:gridCol w:w="3000"/>
+      </w:tblGrid>
+      <w:tr>
+        <w:trPr>
+          <w:tblHeader/>
+        </w:trPr>
+        <w:tc>
+          <w:tcPr>
+            <w:tcW w:w="0" w:type="auto"/>
+            <w:tcBorders>
+              <w:top w:val="single" w:sz="6" w:space="0" w:color="auto"/>
+              <w:left w:val="single" w:sz="6" w:space="0" w:color="auto"/>
+              <w:bottom w:val="single" w:sz="6" w:space="0" w:color="auto"/>
+              <w:right w:val="single" w:sz="6" w:space="0" w:color="auto"/>
+            </w:tcBorders>
+            <w:tcMar>
+              <w:top w:w="105" w:type="dxa"/>
+              <w:left w:w="150" w:type="dxa"/>
+              <w:bottom w:w="105" w:type="dxa"/>
+              <w:right w:w="150" w:type="dxa"/>
+            </w:tcMar>
+          </w:tcPr>
+          <w:p>
+            <w:r>
+              <w:rPr>
+                <w:b/>
+                <w:bCs/>
+              </w:rPr>
+              <w:t xml:space="preserve">Item</w:t>
+            </w:r>
+          </w:p>
+        </w:tc>
+        <w:tc>
+          <w:tcPr>
+            <w:tcW w:w="0" w:type="auto"/>
+            <w:tcBorders>
+              <w:top w:val="single" w:sz="6" w:space="0" w:color="auto"/>
+              <w:left w:val="single" w:sz="6" w:space="0" w:color="auto"/>
+              <w:bottom w:val="single" w:sz="6" w:space="0" w:color="auto"/>
+              <w:right w:val="single" w:sz="6" w:space="0" w:color="auto"/>
+            </w:tcBorders>
+            <w:tcMar>
+              <w:top w:w="105" w:type="dxa"/>
+              <w:left w:w="150" w:type="dxa"/>
+              <w:bottom w:w="105" w:type="dxa"/>
+              <w:right w:w="150" w:type="dxa"/>
+            </w:tcMar>
+          </w:tcPr>
+          <w:p>
+            <w:r>
+              <w:rPr>
+                <w:b/>
+                <w:bCs/>
+              </w:rPr>
+              <w:t xml:space="preserve">Changed?</w:t>
+            </w:r>
+          </w:p>
+        </w:tc>
+      </w:tr>
+      <w:tr>
+        <w:tc>
+          <w:tcPr>
+            <w:tcW w:w="0" w:type="auto"/>
+            <w:tcBorders>
+              <w:top w:val="single" w:sz="6" w:space="0" w:color="auto"/>
+              <w:left w:val="single" w:sz="6" w:space="0" w:color="auto"/>
+              <w:bottom w:val="single" w:sz="6" w:space="0" w:color="auto"/>
+              <w:right w:val="single" w:sz="6" w:space="0" w:color="auto"/>
+            </w:tcBorders>
+            <w:tcMar>
+              <w:top w:w="105" w:type="dxa"/>
+              <w:left w:w="150" w:type="dxa"/>
+              <w:bottom w:w="105" w:type="dxa"/>
+              <w:right w:w="150" w:type="dxa"/>
+            </w:tcMar>
+          </w:tcPr>
+          <w:p>
+            <w:r>
+              <w:t xml:space="preserve">How a job logs in</w:t>
+            </w:r>
+          </w:p>
+        </w:tc>
+        <w:tc>
+          <w:tcPr>
+            <w:tcW w:w="0" w:type="auto"/>
+            <w:tcBorders>
+              <w:top w:val="single" w:sz="6" w:space="0" w:color="auto"/>
+              <w:left w:val="single" w:sz="6" w:space="0" w:color="auto"/>
+              <w:bottom w:val="single" w:sz="6" w:space="0" w:color="auto"/>
+              <w:right w:val="single" w:sz="6" w:space="0" w:color="auto"/>
+            </w:tcBorders>
+            <w:tcMar>
+              <w:top w:w="105" w:type="dxa"/>
+              <w:left w:w="150" w:type="dxa"/>
+              <w:bottom w:w="105" w:type="dxa"/>
+              <w:right w:w="150" w:type="dxa"/>
+            </w:tcMar>
+          </w:tcPr>
+          <w:p>
+            <w:r>
+              <w:t xml:space="preserve">Yes. This is the whole change.</w:t>
+            </w:r>
+          </w:p>
+        </w:tc>
+      </w:tr>
+      <w:tr>
+        <w:tc>
+          <w:tcPr>
+            <w:tcW w:w="0" w:type="auto"/>
+            <w:tcBorders>
+              <w:top w:val="single" w:sz="6" w:space="0" w:color="auto"/>
+              <w:left w:val="single" w:sz="6" w:space="0" w:color="auto"/>
+              <w:bottom w:val="single" w:sz="6" w:space="0" w:color="auto"/>
+              <w:right w:val="single" w:sz="6" w:space="0" w:color="auto"/>
+            </w:tcBorders>
+            <w:tcMar>
+              <w:top w:w="105" w:type="dxa"/>
+              <w:left w:w="150" w:type="dxa"/>
+              <w:bottom w:w="105" w:type="dxa"/>
+              <w:right w:w="150" w:type="dxa"/>
+            </w:tcMar>
+          </w:tcPr>
+          <w:p>
+            <w:r>
+              <w:t xml:space="preserve">Four login lines in each bean</w:t>
+            </w:r>
+          </w:p>
+        </w:tc>
+        <w:tc>
+          <w:tcPr>
+            <w:tcW w:w="0" w:type="auto"/>
+            <w:tcBorders>
+              <w:top w:val="single" w:sz="6" w:space="0" w:color="auto"/>
+              <w:left w:val="single" w:sz="6" w:space="0" w:color="auto"/>
+              <w:bottom w:val="single" w:sz="6" w:space="0" w:color="auto"/>
+              <w:right w:val="single" w:sz="6" w:space="0" w:color="auto"/>
+            </w:tcBorders>
+            <w:tcMar>
+              <w:top w:w="105" w:type="dxa"/>
+              <w:left w:w="150" w:type="dxa"/>
+              <w:bottom w:w="105" w:type="dxa"/>
+              <w:right w:w="150" w:type="dxa"/>
+            </w:tcMar>
+          </w:tcPr>
+          <w:p>
+            <w:r>
+              <w:t xml:space="preserve">Yes. Removed.</w:t>
+            </w:r>
+          </w:p>
+        </w:tc>
+      </w:tr>
+      <w:tr>
+        <w:tc>
+          <w:tcPr>
+            <w:tcW w:w="0" w:type="auto"/>
+            <w:tcBorders>
+              <w:top w:val="single" w:sz="6" w:space="0" w:color="auto"/>
+              <w:left w:val="single" w:sz="6" w:space="0" w:color="auto"/>
+              <w:bottom w:val="single" w:sz="6" w:space="0" w:color="auto"/>
+              <w:right w:val="single" w:sz="6" w:space="0" w:color="auto"/>
+            </w:tcBorders>
+            <w:tcMar>
+              <w:top w:w="105" w:type="dxa"/>
+              <w:left w:w="150" w:type="dxa"/>
+              <w:bottom w:w="105" w:type="dxa"/>
+              <w:right w:w="150" w:type="dxa"/>
+            </w:tcMar>
+          </w:tcPr>
+          <w:p>
+            <w:r>
+              <w:t xml:space="preserve">Everything else in the bean file</w:t>
+            </w:r>
+          </w:p>
+        </w:tc>
+        <w:tc>
+          <w:tcPr>
+            <w:tcW w:w="0" w:type="auto"/>
+            <w:tcBorders>
+              <w:top w:val="single" w:sz="6" w:space="0" w:color="auto"/>
+              <w:left w:val="single" w:sz="6" w:space="0" w:color="auto"/>
+              <w:bottom w:val="single" w:sz="6" w:space="0" w:color="auto"/>
+              <w:right w:val="single" w:sz="6" w:space="0" w:color="auto"/>
+            </w:tcBorders>
+            <w:tcMar>
+              <w:top w:w="105" w:type="dxa"/>
+              <w:left w:w="150" w:type="dxa"/>
+              <w:bottom w:w="105" w:type="dxa"/>
+              <w:right w:w="150" w:type="dxa"/>
+            </w:tcMar>
+          </w:tcPr>
+          <w:p>
+            <w:r>
+              <w:t xml:space="preserve">No.</w:t>
+            </w:r>
+          </w:p>
+        </w:tc>
+      </w:tr>
+      <w:tr>
+        <w:tc>
+          <w:tcPr>
+            <w:tcW w:w="0" w:type="auto"/>
+            <w:tcBorders>
+              <w:top w:val="single" w:sz="6" w:space="0" w:color="auto"/>
+              <w:left w:val="single" w:sz="6" w:space="0" w:color="auto"/>
+              <w:bottom w:val="single" w:sz="6" w:space="0" w:color="auto"/>
+              <w:right w:val="single" w:sz="6" w:space="0" w:color="auto"/>
+            </w:tcBorders>
+            <w:tcMar>
+              <w:top w:w="105" w:type="dxa"/>
+              <w:left w:w="150" w:type="dxa"/>
+              <w:bottom w:w="105" w:type="dxa"/>
+              <w:right w:w="150" w:type="dxa"/>
+            </w:tcMar>
+          </w:tcPr>
+          <w:p>
+            <w:r>
+              <w:t xml:space="preserve">SDL mapping files</w:t>
+            </w:r>
+          </w:p>
+        </w:tc>
+        <w:tc>
+          <w:tcPr>
+            <w:tcW w:w="0" w:type="auto"/>
+            <w:tcBorders>
+              <w:top w:val="single" w:sz="6" w:space="0" w:color="auto"/>
+              <w:left w:val="single" w:sz="6" w:space="0" w:color="auto"/>
+              <w:bottom w:val="single" w:sz="6" w:space="0" w:color="auto"/>
+              <w:right w:val="single" w:sz="6" w:space="0" w:color="auto"/>
+            </w:tcBorders>
+            <w:tcMar>
+              <w:top w:w="105" w:type="dxa"/>
+              <w:left w:w="150" w:type="dxa"/>
+              <w:bottom w:w="105" w:type="dxa"/>
+              <w:right w:w="150" w:type="dxa"/>
+            </w:tcMar>
+          </w:tcPr>
+          <w:p>
+            <w:r>
+              <w:t xml:space="preserve">No.</w:t>
+            </w:r>
+          </w:p>
+        </w:tc>
+      </w:tr>
+      <w:tr>
+        <w:tc>
+          <w:tcPr>
+            <w:tcW w:w="0" w:type="auto"/>
+            <w:tcBorders>
+              <w:top w:val="single" w:sz="6" w:space="0" w:color="auto"/>
+              <w:left w:val="single" w:sz="6" w:space="0" w:color="auto"/>
+              <w:bottom w:val="single" w:sz="6" w:space="0" w:color="auto"/>
+              <w:right w:val="single" w:sz="6" w:space="0" w:color="auto"/>
+            </w:tcBorders>
+            <w:tcMar>
+              <w:top w:w="105" w:type="dxa"/>
+              <w:left w:w="150" w:type="dxa"/>
+              <w:bottom w:w="105" w:type="dxa"/>
+              <w:right w:w="150" w:type="dxa"/>
+            </w:tcMar>
+          </w:tcPr>
+          <w:p>
+            <w:r>
+              <w:t xml:space="preserve">File and folder paths</w:t>
+            </w:r>
+          </w:p>
+        </w:tc>
+        <w:tc>
+          <w:tcPr>
+            <w:tcW w:w="0" w:type="auto"/>
+            <w:tcBorders>
+              <w:top w:val="single" w:sz="6" w:space="0" w:color="auto"/>
+              <w:left w:val="single" w:sz="6" w:space="0" w:color="auto"/>
+              <w:bottom w:val="single" w:sz="6" w:space="0" w:color="auto"/>
+              <w:right w:val="single" w:sz="6" w:space="0" w:color="auto"/>
+            </w:tcBorders>
+            <w:tcMar>
+              <w:top w:w="105" w:type="dxa"/>
+              <w:left w:w="150" w:type="dxa"/>
+              <w:bottom w:w="105" w:type="dxa"/>
+              <w:right w:w="150" w:type="dxa"/>
+            </w:tcMar>
+          </w:tcPr>
+          <w:p>
+            <w:r>
+              <w:t xml:space="preserve">No.</w:t>
+            </w:r>
+          </w:p>
+        </w:tc>
+      </w:tr>
+      <w:tr>
+        <w:tc>
+          <w:tcPr>
+            <w:tcW w:w="0" w:type="auto"/>
+            <w:tcBorders>
+              <w:top w:val="single" w:sz="6" w:space="0" w:color="auto"/>
+              <w:left w:val="single" w:sz="6" w:space="0" w:color="auto"/>
+              <w:bottom w:val="single" w:sz="6" w:space="0" w:color="auto"/>
+              <w:right w:val="single" w:sz="6" w:space="0" w:color="auto"/>
+            </w:tcBorders>
+            <w:tcMar>
+              <w:top w:w="105" w:type="dxa"/>
+              <w:left w:w="150" w:type="dxa"/>
+              <w:bottom w:w="105" w:type="dxa"/>
+              <w:right w:w="150" w:type="dxa"/>
+            </w:tcMar>
+          </w:tcPr>
+          <w:p>
+            <w:r>
+              <w:t xml:space="preserve">Batch size, timeout, timezone</w:t>
+            </w:r>
+          </w:p>
+        </w:tc>
+        <w:tc>
+          <w:tcPr>
+            <w:tcW w:w="0" w:type="auto"/>
+            <w:tcBorders>
+              <w:top w:val="single" w:sz="6" w:space="0" w:color="auto"/>
+              <w:left w:val="single" w:sz="6" w:space="0" w:color="auto"/>
+              <w:bottom w:val="single" w:sz="6" w:space="0" w:color="auto"/>
+              <w:right w:val="single" w:sz="6" w:space="0" w:color="auto"/>
+            </w:tcBorders>
+            <w:tcMar>
+              <w:top w:w="105" w:type="dxa"/>
+              <w:left w:w="150" w:type="dxa"/>
+              <w:bottom w:w="105" w:type="dxa"/>
+              <w:right w:w="150" w:type="dxa"/>
+            </w:tcMar>
+          </w:tcPr>
+          <w:p>
+            <w:r>
+              <w:t xml:space="preserve">No.</w:t>
+            </w:r>
+          </w:p>
+        </w:tc>
+      </w:tr>
+      <w:tr>
+        <w:tc>
+          <w:tcPr>
+            <w:tcW w:w="0" w:type="auto"/>
+            <w:tcBorders>
+              <w:top w:val="single" w:sz="6" w:space="0" w:color="auto"/>
+              <w:left w:val="single" w:sz="6" w:space="0" w:color="auto"/>
+              <w:bottom w:val="single" w:sz="6" w:space="0" w:color="auto"/>
+              <w:right w:val="single" w:sz="6" w:space="0" w:color="auto"/>
+            </w:tcBorders>
+            <w:tcMar>
+              <w:top w:w="105" w:type="dxa"/>
+              <w:left w:w="150" w:type="dxa"/>
+              <w:bottom w:w="105" w:type="dxa"/>
+              <w:right w:w="150" w:type="dxa"/>
+            </w:tcMar>
+          </w:tcPr>
+          <w:p>
+            <w:r>
+              <w:t xml:space="preserve">Scheduled tasks and their timings</w:t>
+            </w:r>
+          </w:p>
+        </w:tc>
+        <w:tc>
+          <w:tcPr>
+            <w:tcW w:w="0" w:type="auto"/>
+            <w:tcBorders>
+              <w:top w:val="single" w:sz="6" w:space="0" w:color="auto"/>
+              <w:left w:val="single" w:sz="6" w:space="0" w:color="auto"/>
+              <w:bottom w:val="single" w:sz="6" w:space="0" w:color="auto"/>
+              <w:right w:val="single" w:sz="6" w:space="0" w:color="auto"/>
+            </w:tcBorders>
+            <w:tcMar>
+              <w:top w:w="105" w:type="dxa"/>
+              <w:left w:w="150" w:type="dxa"/>
+              <w:bottom w:w="105" w:type="dxa"/>
+              <w:right w:w="150" w:type="dxa"/>
+            </w:tcMar>
+          </w:tcPr>
+          <w:p>
+            <w:r>
+              <w:t xml:space="preserve">No.</w:t>
+            </w:r>
+          </w:p>
+        </w:tc>
+      </w:tr>
+      <w:tr>
+        <w:tc>
+          <w:tcPr>
+            <w:tcW w:w="0" w:type="auto"/>
+            <w:tcBorders>
+              <w:top w:val="single" w:sz="6" w:space="0" w:color="auto"/>
+              <w:left w:val="single" w:sz="6" w:space="0" w:color="auto"/>
+              <w:bottom w:val="single" w:sz="6" w:space="0" w:color="auto"/>
+              <w:right w:val="single" w:sz="6" w:space="0" w:color="auto"/>
+            </w:tcBorders>
+            <w:tcMar>
+              <w:top w:w="105" w:type="dxa"/>
+              <w:left w:w="150" w:type="dxa"/>
+              <w:bottom w:w="105" w:type="dxa"/>
+              <w:right w:w="150" w:type="dxa"/>
+            </w:tcMar>
+          </w:tcPr>
+          <w:p>
+            <w:r>
+              <w:t xml:space="preserve">What each job does</w:t>
+            </w:r>
+          </w:p>
+        </w:tc>
+        <w:tc>
+          <w:tcPr>
+            <w:tcW w:w="0" w:type="auto"/>
+            <w:tcBorders>
+              <w:top w:val="single" w:sz="6" w:space="0" w:color="auto"/>
+              <w:left w:val="single" w:sz="6" w:space="0" w:color="auto"/>
+              <w:bottom w:val="single" w:sz="6" w:space="0" w:color="auto"/>
+              <w:right w:val="single" w:sz="6" w:space="0" w:color="auto"/>
+            </w:tcBorders>
+            <w:tcMar>
+              <w:top w:w="105" w:type="dxa"/>
+              <w:left w:w="150" w:type="dxa"/>
+              <w:bottom w:w="105" w:type="dxa"/>
+              <w:right w:w="150" w:type="dxa"/>
+            </w:tcMar>
+          </w:tcPr>
+          <w:p>
+            <w:r>
+              <w:t xml:space="preserve">No.</w:t>
+            </w:r>
+          </w:p>
+        </w:tc>
+      </w:tr>
+    </w:tbl>
     <w:p/>
     <w:p>
       <w:pPr>
@@ -2345,12 +2186,7 @@
           <w:b/>
           <w:bCs/>
         </w:rPr>
-        <w:t xml:space="preserve">What Remains Unchanged</w:t>
-      </w:r>
-    </w:p>
-    <w:p>
-      <w:r>
-        <w:t xml:space="preserve">This migration replaces the login method and nothing else. The following are carried over from the production server untouched:</w:t>
+        <w:t xml:space="preserve">Validation</w:t>
       </w:r>
     </w:p>
     <w:p>
@@ -2362,7 +2198,7 @@
         <w:ind w:left="720"/>
       </w:pPr>
       <w:r>
-        <w:t xml:space="preserve">The bean files, apart from the four login entries removed from each.</w:t>
+        <w:t xml:space="preserve">The org name printed at the start of the run was the intended one.</w:t>
       </w:r>
     </w:p>
     <w:p>
@@ -2374,7 +2210,7 @@
         <w:ind w:left="720"/>
       </w:pPr>
       <w:r>
-        <w:t xml:space="preserve">The SDL mapping files.</w:t>
+        <w:t xml:space="preserve">No login or permission error in the log.</w:t>
       </w:r>
     </w:p>
     <w:p>
@@ -2386,7 +2222,7 @@
         <w:ind w:left="720"/>
       </w:pPr>
       <w:r>
-        <w:t xml:space="preserve">Every file path: source data, load results, archive folders and logs.</w:t>
+        <w:t xml:space="preserve">A read only job returned the expected number of records.</w:t>
       </w:r>
     </w:p>
     <w:p>
@@ -2398,7 +2234,7 @@
         <w:ind w:left="720"/>
       </w:pPr>
       <w:r>
-        <w:t xml:space="preserve">The batch size, timeout, timezone and every other Data Loader setting in the beans.</w:t>
+        <w:t xml:space="preserve">A data load finished with success and failure counts matching earlier runs.</w:t>
       </w:r>
     </w:p>
     <w:p>
@@ -2410,7 +2246,7 @@
         <w:ind w:left="720"/>
       </w:pPr>
       <w:r>
-        <w:t xml:space="preserve">The folder structure on the server.</w:t>
+        <w:t xml:space="preserve">Result, archive and log files appeared in their usual folders.</w:t>
       </w:r>
     </w:p>
     <w:p>
@@ -2422,12 +2258,7 @@
         <w:ind w:left="720"/>
       </w:pPr>
       <w:r>
-        <w:t xml:space="preserve">The scheduled tasks and the order the jobs run in.</w:t>
-      </w:r>
-    </w:p>
-    <w:p>
-      <w:r>
-        <w:t xml:space="preserve">The bean file remains the single source of truth for what each job does. The entity, the operation, the source or output file and the mapping file are all still read from it.</w:t>
+        <w:t xml:space="preserve">The Run As user’s login history in Salesforce shows the connection, unblocked.</w:t>
       </w:r>
     </w:p>
     <w:p/>
@@ -2443,293 +2274,494 @@
           <w:b/>
           <w:bCs/>
         </w:rPr>
-        <w:t xml:space="preserve">Validation</w:t>
-      </w:r>
-    </w:p>
-    <w:p>
-      <w:r>
-        <w:t xml:space="preserve">Validate the following after the credentials file is in place:</w:t>
-      </w:r>
-    </w:p>
-    <w:p>
-      <w:pPr>
-        <w:numPr>
-          <w:ilvl w:val="0"/>
-          <w:numId w:val="4"/>
-        </w:numPr>
-        <w:ind w:left="720"/>
-      </w:pPr>
-      <w:r>
-        <w:t xml:space="preserve">The token request succeeds and no authentication error appears in the log.</w:t>
-      </w:r>
-    </w:p>
-    <w:p>
-      <w:pPr>
-        <w:numPr>
-          <w:ilvl w:val="0"/>
-          <w:numId w:val="4"/>
-        </w:numPr>
-        <w:ind w:left="720"/>
-      </w:pPr>
-      <w:r>
-        <w:t xml:space="preserve">The target org printed at the start of the run is the org that was intended.</w:t>
-      </w:r>
-    </w:p>
-    <w:p>
-      <w:pPr>
-        <w:numPr>
-          <w:ilvl w:val="0"/>
-          <w:numId w:val="4"/>
-        </w:numPr>
-        <w:ind w:left="720"/>
-      </w:pPr>
-      <w:r>
-        <w:t xml:space="preserve">A read-only job completes and returns the row count that is expected.</w:t>
-      </w:r>
-    </w:p>
-    <w:p>
-      <w:pPr>
-        <w:numPr>
-          <w:ilvl w:val="0"/>
-          <w:numId w:val="4"/>
-        </w:numPr>
-        <w:ind w:left="720"/>
-      </w:pPr>
-      <w:r>
-        <w:t xml:space="preserve">A bulk load completes, and the success and error counts match what the same job produced before the migration.</w:t>
-      </w:r>
-    </w:p>
-    <w:p>
-      <w:pPr>
-        <w:numPr>
-          <w:ilvl w:val="0"/>
-          <w:numId w:val="4"/>
-        </w:numPr>
-        <w:ind w:left="720"/>
-      </w:pPr>
-      <w:r>
-        <w:t xml:space="preserve">Result, archive and log files land in the same folders they always did.</w:t>
-      </w:r>
-    </w:p>
-    <w:p>
-      <w:pPr>
-        <w:numPr>
-          <w:ilvl w:val="0"/>
-          <w:numId w:val="4"/>
-        </w:numPr>
-        <w:ind w:left="720"/>
-      </w:pPr>
-      <w:r>
-        <w:t xml:space="preserve">The login history of the Run As user shows the connection, and shows it was not blocked by an IP restriction.</w:t>
-      </w:r>
-    </w:p>
-    <w:p/>
-    <w:p>
-      <w:pPr>
-        <w:rPr>
-          <w:b/>
-          <w:bCs/>
-        </w:rPr>
-      </w:pPr>
-      <w:r>
-        <w:rPr>
-          <w:b/>
-          <w:bCs/>
-        </w:rPr>
-        <w:t xml:space="preserve">Troubleshooting Checklist</w:t>
-      </w:r>
-    </w:p>
-    <w:p>
-      <w:r>
-        <w:t xml:space="preserve">If authentication fails, verify:</w:t>
-      </w:r>
-    </w:p>
-    <w:p>
-      <w:pPr>
-        <w:numPr>
-          <w:ilvl w:val="0"/>
-          <w:numId w:val="4"/>
-        </w:numPr>
-        <w:ind w:left="720"/>
-      </w:pPr>
-      <w:r>
-        <w:t xml:space="preserve">clientcreds.json is present in the NLG Config folder, not in an individual job’s Config folder.</w:t>
-      </w:r>
-    </w:p>
-    <w:p>
-      <w:pPr>
-        <w:numPr>
-          <w:ilvl w:val="0"/>
-          <w:numId w:val="4"/>
-        </w:numPr>
-        <w:ind w:left="720"/>
-      </w:pPr>
-      <w:r>
-        <w:t xml:space="preserve">All four keys are present in it: domain, clientId, clientSecret and org.</w:t>
-      </w:r>
-    </w:p>
-    <w:p>
-      <w:pPr>
-        <w:numPr>
-          <w:ilvl w:val="0"/>
-          <w:numId w:val="4"/>
-        </w:numPr>
-        <w:ind w:left="720"/>
-      </w:pPr>
-      <w:r>
-        <w:t xml:space="preserve">domain is the org’s My Domain URL. A generic login URL will not serve the Client Credentials flow.</w:t>
-      </w:r>
-    </w:p>
-    <w:p>
-      <w:pPr>
-        <w:numPr>
-          <w:ilvl w:val="0"/>
-          <w:numId w:val="4"/>
-        </w:numPr>
-        <w:ind w:left="720"/>
-      </w:pPr>
-      <w:r>
-        <w:t xml:space="preserve">The sandbox URL is being used while testing, and the production URL only when cutting over.</w:t>
-      </w:r>
-    </w:p>
-    <w:p>
-      <w:pPr>
-        <w:numPr>
-          <w:ilvl w:val="0"/>
-          <w:numId w:val="4"/>
-        </w:numPr>
-        <w:ind w:left="720"/>
-      </w:pPr>
-      <w:r>
-        <w:t xml:space="preserve">The Client Credentials flow is enabled on the External Client App.</w:t>
-      </w:r>
-    </w:p>
-    <w:p>
-      <w:pPr>
-        <w:numPr>
-          <w:ilvl w:val="0"/>
-          <w:numId w:val="4"/>
-        </w:numPr>
-        <w:ind w:left="720"/>
-      </w:pPr>
-      <w:r>
-        <w:t xml:space="preserve">A Run As user is set on the app, and that user is active.</w:t>
-      </w:r>
-    </w:p>
-    <w:p>
-      <w:pPr>
-        <w:numPr>
-          <w:ilvl w:val="0"/>
-          <w:numId w:val="4"/>
-        </w:numPr>
-        <w:ind w:left="720"/>
-      </w:pPr>
-      <w:r>
-        <w:t xml:space="preserve">The Run As user has the permissions the job needs on the object it touches.</w:t>
-      </w:r>
-    </w:p>
-    <w:p>
-      <w:pPr>
-        <w:numPr>
-          <w:ilvl w:val="0"/>
-          <w:numId w:val="4"/>
-        </w:numPr>
-        <w:ind w:left="720"/>
-      </w:pPr>
-      <w:r>
-        <w:t xml:space="preserve">No Login IP range blocks the batch server’s outbound address.</w:t>
-      </w:r>
-    </w:p>
-    <w:p>
-      <w:pPr>
-        <w:numPr>
-          <w:ilvl w:val="0"/>
-          <w:numId w:val="4"/>
-        </w:numPr>
-        <w:ind w:left="720"/>
-      </w:pPr>
-      <w:r>
-        <w:t xml:space="preserve">The client secret was copied in full and has not been regenerated since.</w:t>
-      </w:r>
-    </w:p>
-    <w:p>
-      <w:pPr>
-        <w:numPr>
-          <w:ilvl w:val="0"/>
-          <w:numId w:val="4"/>
-        </w:numPr>
-        <w:ind w:left="720"/>
-      </w:pPr>
-      <w:r>
-        <w:t xml:space="preserve">The org alias in the credentials file matches the alias the run reports.</w:t>
-      </w:r>
-    </w:p>
-    <w:p/>
-    <w:p>
-      <w:r>
-        <w:t xml:space="preserve">If the CLI itself is the problem, verify:</w:t>
-      </w:r>
-    </w:p>
-    <w:p>
-      <w:pPr>
-        <w:numPr>
-          <w:ilvl w:val="0"/>
-          <w:numId w:val="4"/>
-        </w:numPr>
-        <w:ind w:left="720"/>
-      </w:pPr>
-      <w:r>
-        <w:t xml:space="preserve">sf --version responds in a new Command Prompt.</w:t>
-      </w:r>
-    </w:p>
-    <w:p>
-      <w:pPr>
-        <w:numPr>
-          <w:ilvl w:val="0"/>
-          <w:numId w:val="4"/>
-        </w:numPr>
-        <w:ind w:left="720"/>
-      </w:pPr>
-      <w:r>
-        <w:t xml:space="preserve">It also responds when run as the account the scheduled task uses, not only as the administrator who installed it.</w:t>
-      </w:r>
-    </w:p>
-    <w:p>
-      <w:pPr>
-        <w:numPr>
-          <w:ilvl w:val="0"/>
-          <w:numId w:val="4"/>
-        </w:numPr>
-        <w:ind w:left="720"/>
-      </w:pPr>
-      <w:r>
-        <w:t xml:space="preserve">The installed release recognises every bulk data command the jobs use.</w:t>
-      </w:r>
-    </w:p>
-    <w:p>
-      <w:pPr>
-        <w:numPr>
-          <w:ilvl w:val="0"/>
-          <w:numId w:val="4"/>
-        </w:numPr>
-        <w:ind w:left="720"/>
-      </w:pPr>
-      <w:r>
-        <w:t xml:space="preserve">The job account has a loadable Windows profile the CLI can write its persisted login into.</w:t>
-      </w:r>
-    </w:p>
-    <w:p>
-      <w:pPr>
-        <w:numPr>
-          <w:ilvl w:val="0"/>
-          <w:numId w:val="4"/>
-        </w:numPr>
-        <w:ind w:left="720"/>
-      </w:pPr>
-      <w:r>
-        <w:t xml:space="preserve">Proxy environment variables are set for the job account, if the server uses a proxy.</w:t>
-      </w:r>
-    </w:p>
+        <w:t xml:space="preserve">Troubleshooting</w:t>
+      </w:r>
+    </w:p>
+    <w:tbl>
+      <w:tblPr>
+        <w:tblW w:w="0" w:type="auto"/>
+        <w:tblCellMar>
+          <w:left w:w="0" w:type="dxa"/>
+          <w:right w:w="0" w:type="dxa"/>
+        </w:tblCellMar>
+        <w:tblLook w:val="04A0" w:firstRow="1" w:lastRow="0" w:firstColumn="1" w:lastColumn="0" w:noHBand="0" w:noVBand="1"/>
+      </w:tblPr>
+      <w:tblGrid>
+        <w:gridCol w:w="2800"/>
+        <w:gridCol w:w="4400"/>
+      </w:tblGrid>
+      <w:tr>
+        <w:trPr>
+          <w:tblHeader/>
+        </w:trPr>
+        <w:tc>
+          <w:tcPr>
+            <w:tcW w:w="0" w:type="auto"/>
+            <w:tcBorders>
+              <w:top w:val="single" w:sz="6" w:space="0" w:color="auto"/>
+              <w:left w:val="single" w:sz="6" w:space="0" w:color="auto"/>
+              <w:bottom w:val="single" w:sz="6" w:space="0" w:color="auto"/>
+              <w:right w:val="single" w:sz="6" w:space="0" w:color="auto"/>
+            </w:tcBorders>
+            <w:tcMar>
+              <w:top w:w="105" w:type="dxa"/>
+              <w:left w:w="150" w:type="dxa"/>
+              <w:bottom w:w="105" w:type="dxa"/>
+              <w:right w:w="150" w:type="dxa"/>
+            </w:tcMar>
+          </w:tcPr>
+          <w:p>
+            <w:r>
+              <w:rPr>
+                <w:b/>
+                <w:bCs/>
+              </w:rPr>
+              <w:t xml:space="preserve">What you see</w:t>
+            </w:r>
+          </w:p>
+        </w:tc>
+        <w:tc>
+          <w:tcPr>
+            <w:tcW w:w="0" w:type="auto"/>
+            <w:tcBorders>
+              <w:top w:val="single" w:sz="6" w:space="0" w:color="auto"/>
+              <w:left w:val="single" w:sz="6" w:space="0" w:color="auto"/>
+              <w:bottom w:val="single" w:sz="6" w:space="0" w:color="auto"/>
+              <w:right w:val="single" w:sz="6" w:space="0" w:color="auto"/>
+            </w:tcBorders>
+            <w:tcMar>
+              <w:top w:w="105" w:type="dxa"/>
+              <w:left w:w="150" w:type="dxa"/>
+              <w:bottom w:w="105" w:type="dxa"/>
+              <w:right w:w="150" w:type="dxa"/>
+            </w:tcMar>
+          </w:tcPr>
+          <w:p>
+            <w:r>
+              <w:rPr>
+                <w:b/>
+                <w:bCs/>
+              </w:rPr>
+              <w:t xml:space="preserve">What to check</w:t>
+            </w:r>
+          </w:p>
+        </w:tc>
+      </w:tr>
+      <w:tr>
+        <w:tc>
+          <w:tcPr>
+            <w:tcW w:w="0" w:type="auto"/>
+            <w:tcBorders>
+              <w:top w:val="single" w:sz="6" w:space="0" w:color="auto"/>
+              <w:left w:val="single" w:sz="6" w:space="0" w:color="auto"/>
+              <w:bottom w:val="single" w:sz="6" w:space="0" w:color="auto"/>
+              <w:right w:val="single" w:sz="6" w:space="0" w:color="auto"/>
+            </w:tcBorders>
+            <w:tcMar>
+              <w:top w:w="105" w:type="dxa"/>
+              <w:left w:w="150" w:type="dxa"/>
+              <w:bottom w:w="105" w:type="dxa"/>
+              <w:right w:w="150" w:type="dxa"/>
+            </w:tcMar>
+          </w:tcPr>
+          <w:p>
+            <w:r>
+              <w:t xml:space="preserve">sf is not recognised as a command</w:t>
+            </w:r>
+          </w:p>
+        </w:tc>
+        <w:tc>
+          <w:tcPr>
+            <w:tcW w:w="0" w:type="auto"/>
+            <w:tcBorders>
+              <w:top w:val="single" w:sz="6" w:space="0" w:color="auto"/>
+              <w:left w:val="single" w:sz="6" w:space="0" w:color="auto"/>
+              <w:bottom w:val="single" w:sz="6" w:space="0" w:color="auto"/>
+              <w:right w:val="single" w:sz="6" w:space="0" w:color="auto"/>
+            </w:tcBorders>
+            <w:tcMar>
+              <w:top w:w="105" w:type="dxa"/>
+              <w:left w:w="150" w:type="dxa"/>
+              <w:bottom w:w="105" w:type="dxa"/>
+              <w:right w:w="150" w:type="dxa"/>
+            </w:tcMar>
+          </w:tcPr>
+          <w:p>
+            <w:r>
+              <w:t xml:space="preserve">The CLI is not installed, or the Command Prompt was open before it was installed. Open a new one. Part 2 Step 2.</w:t>
+            </w:r>
+          </w:p>
+        </w:tc>
+      </w:tr>
+      <w:tr>
+        <w:tc>
+          <w:tcPr>
+            <w:tcW w:w="0" w:type="auto"/>
+            <w:tcBorders>
+              <w:top w:val="single" w:sz="6" w:space="0" w:color="auto"/>
+              <w:left w:val="single" w:sz="6" w:space="0" w:color="auto"/>
+              <w:bottom w:val="single" w:sz="6" w:space="0" w:color="auto"/>
+              <w:right w:val="single" w:sz="6" w:space="0" w:color="auto"/>
+            </w:tcBorders>
+            <w:tcMar>
+              <w:top w:w="105" w:type="dxa"/>
+              <w:left w:w="150" w:type="dxa"/>
+              <w:bottom w:w="105" w:type="dxa"/>
+              <w:right w:w="150" w:type="dxa"/>
+            </w:tcMar>
+          </w:tcPr>
+          <w:p>
+            <w:r>
+              <w:t xml:space="preserve">Works by hand, fails when scheduled</w:t>
+            </w:r>
+          </w:p>
+        </w:tc>
+        <w:tc>
+          <w:tcPr>
+            <w:tcW w:w="0" w:type="auto"/>
+            <w:tcBorders>
+              <w:top w:val="single" w:sz="6" w:space="0" w:color="auto"/>
+              <w:left w:val="single" w:sz="6" w:space="0" w:color="auto"/>
+              <w:bottom w:val="single" w:sz="6" w:space="0" w:color="auto"/>
+              <w:right w:val="single" w:sz="6" w:space="0" w:color="auto"/>
+            </w:tcBorders>
+            <w:tcMar>
+              <w:top w:w="105" w:type="dxa"/>
+              <w:left w:w="150" w:type="dxa"/>
+              <w:bottom w:w="105" w:type="dxa"/>
+              <w:right w:w="150" w:type="dxa"/>
+            </w:tcMar>
+          </w:tcPr>
+          <w:p>
+            <w:r>
+              <w:t xml:space="preserve">The scheduled task runs as a different Windows account that cannot find the CLI, or has no profile to save the login into. Part 2 Step 4.</w:t>
+            </w:r>
+          </w:p>
+        </w:tc>
+      </w:tr>
+      <w:tr>
+        <w:tc>
+          <w:tcPr>
+            <w:tcW w:w="0" w:type="auto"/>
+            <w:tcBorders>
+              <w:top w:val="single" w:sz="6" w:space="0" w:color="auto"/>
+              <w:left w:val="single" w:sz="6" w:space="0" w:color="auto"/>
+              <w:bottom w:val="single" w:sz="6" w:space="0" w:color="auto"/>
+              <w:right w:val="single" w:sz="6" w:space="0" w:color="auto"/>
+            </w:tcBorders>
+            <w:tcMar>
+              <w:top w:w="105" w:type="dxa"/>
+              <w:left w:w="150" w:type="dxa"/>
+              <w:bottom w:w="105" w:type="dxa"/>
+              <w:right w:w="150" w:type="dxa"/>
+            </w:tcMar>
+          </w:tcPr>
+          <w:p>
+            <w:r>
+              <w:t xml:space="preserve">Target org unknown, no credentials file</w:t>
+            </w:r>
+          </w:p>
+        </w:tc>
+        <w:tc>
+          <w:tcPr>
+            <w:tcW w:w="0" w:type="auto"/>
+            <w:tcBorders>
+              <w:top w:val="single" w:sz="6" w:space="0" w:color="auto"/>
+              <w:left w:val="single" w:sz="6" w:space="0" w:color="auto"/>
+              <w:bottom w:val="single" w:sz="6" w:space="0" w:color="auto"/>
+              <w:right w:val="single" w:sz="6" w:space="0" w:color="auto"/>
+            </w:tcBorders>
+            <w:tcMar>
+              <w:top w:w="105" w:type="dxa"/>
+              <w:left w:w="150" w:type="dxa"/>
+              <w:bottom w:w="105" w:type="dxa"/>
+              <w:right w:w="150" w:type="dxa"/>
+            </w:tcMar>
+          </w:tcPr>
+          <w:p>
+            <w:r>
+              <w:t xml:space="preserve">clientcreds.json is missing, or sits in a job’s own Config folder instead of the NLG Config folder. Part 3 Step 1.</w:t>
+            </w:r>
+          </w:p>
+        </w:tc>
+      </w:tr>
+      <w:tr>
+        <w:tc>
+          <w:tcPr>
+            <w:tcW w:w="0" w:type="auto"/>
+            <w:tcBorders>
+              <w:top w:val="single" w:sz="6" w:space="0" w:color="auto"/>
+              <w:left w:val="single" w:sz="6" w:space="0" w:color="auto"/>
+              <w:bottom w:val="single" w:sz="6" w:space="0" w:color="auto"/>
+              <w:right w:val="single" w:sz="6" w:space="0" w:color="auto"/>
+            </w:tcBorders>
+            <w:tcMar>
+              <w:top w:w="105" w:type="dxa"/>
+              <w:left w:w="150" w:type="dxa"/>
+              <w:bottom w:w="105" w:type="dxa"/>
+              <w:right w:w="150" w:type="dxa"/>
+            </w:tcMar>
+          </w:tcPr>
+          <w:p>
+            <w:r>
+              <w:t xml:space="preserve">Login refused</w:t>
+            </w:r>
+          </w:p>
+        </w:tc>
+        <w:tc>
+          <w:tcPr>
+            <w:tcW w:w="0" w:type="auto"/>
+            <w:tcBorders>
+              <w:top w:val="single" w:sz="6" w:space="0" w:color="auto"/>
+              <w:left w:val="single" w:sz="6" w:space="0" w:color="auto"/>
+              <w:bottom w:val="single" w:sz="6" w:space="0" w:color="auto"/>
+              <w:right w:val="single" w:sz="6" w:space="0" w:color="auto"/>
+            </w:tcBorders>
+            <w:tcMar>
+              <w:top w:w="105" w:type="dxa"/>
+              <w:left w:w="150" w:type="dxa"/>
+              <w:bottom w:w="105" w:type="dxa"/>
+              <w:right w:w="150" w:type="dxa"/>
+            </w:tcMar>
+          </w:tcPr>
+          <w:p>
+            <w:r>
+              <w:t xml:space="preserve">Check the ID and Secret were copied in full, the Client Credentials flow is enabled, and the Run As user is set and active.</w:t>
+            </w:r>
+          </w:p>
+        </w:tc>
+      </w:tr>
+      <w:tr>
+        <w:tc>
+          <w:tcPr>
+            <w:tcW w:w="0" w:type="auto"/>
+            <w:tcBorders>
+              <w:top w:val="single" w:sz="6" w:space="0" w:color="auto"/>
+              <w:left w:val="single" w:sz="6" w:space="0" w:color="auto"/>
+              <w:bottom w:val="single" w:sz="6" w:space="0" w:color="auto"/>
+              <w:right w:val="single" w:sz="6" w:space="0" w:color="auto"/>
+            </w:tcBorders>
+            <w:tcMar>
+              <w:top w:w="105" w:type="dxa"/>
+              <w:left w:w="150" w:type="dxa"/>
+              <w:bottom w:w="105" w:type="dxa"/>
+              <w:right w:w="150" w:type="dxa"/>
+            </w:tcMar>
+          </w:tcPr>
+          <w:p>
+            <w:r>
+              <w:t xml:space="preserve">Login refused, address looks correct</w:t>
+            </w:r>
+          </w:p>
+        </w:tc>
+        <w:tc>
+          <w:tcPr>
+            <w:tcW w:w="0" w:type="auto"/>
+            <w:tcBorders>
+              <w:top w:val="single" w:sz="6" w:space="0" w:color="auto"/>
+              <w:left w:val="single" w:sz="6" w:space="0" w:color="auto"/>
+              <w:bottom w:val="single" w:sz="6" w:space="0" w:color="auto"/>
+              <w:right w:val="single" w:sz="6" w:space="0" w:color="auto"/>
+            </w:tcBorders>
+            <w:tcMar>
+              <w:top w:w="105" w:type="dxa"/>
+              <w:left w:w="150" w:type="dxa"/>
+              <w:bottom w:w="105" w:type="dxa"/>
+              <w:right w:w="150" w:type="dxa"/>
+            </w:tcMar>
+          </w:tcPr>
+          <w:p>
+            <w:r>
+              <w:t xml:space="preserve">domain must be the My Domain or sandbox address. The general login address does not work with this flow.</w:t>
+            </w:r>
+          </w:p>
+        </w:tc>
+      </w:tr>
+      <w:tr>
+        <w:tc>
+          <w:tcPr>
+            <w:tcW w:w="0" w:type="auto"/>
+            <w:tcBorders>
+              <w:top w:val="single" w:sz="6" w:space="0" w:color="auto"/>
+              <w:left w:val="single" w:sz="6" w:space="0" w:color="auto"/>
+              <w:bottom w:val="single" w:sz="6" w:space="0" w:color="auto"/>
+              <w:right w:val="single" w:sz="6" w:space="0" w:color="auto"/>
+            </w:tcBorders>
+            <w:tcMar>
+              <w:top w:w="105" w:type="dxa"/>
+              <w:left w:w="150" w:type="dxa"/>
+              <w:bottom w:w="105" w:type="dxa"/>
+              <w:right w:w="150" w:type="dxa"/>
+            </w:tcMar>
+          </w:tcPr>
+          <w:p>
+            <w:r>
+              <w:t xml:space="preserve">Logs in but cannot see or change records</w:t>
+            </w:r>
+          </w:p>
+        </w:tc>
+        <w:tc>
+          <w:tcPr>
+            <w:tcW w:w="0" w:type="auto"/>
+            <w:tcBorders>
+              <w:top w:val="single" w:sz="6" w:space="0" w:color="auto"/>
+              <w:left w:val="single" w:sz="6" w:space="0" w:color="auto"/>
+              <w:bottom w:val="single" w:sz="6" w:space="0" w:color="auto"/>
+              <w:right w:val="single" w:sz="6" w:space="0" w:color="auto"/>
+            </w:tcBorders>
+            <w:tcMar>
+              <w:top w:w="105" w:type="dxa"/>
+              <w:left w:w="150" w:type="dxa"/>
+              <w:bottom w:w="105" w:type="dxa"/>
+              <w:right w:w="150" w:type="dxa"/>
+            </w:tcMar>
+          </w:tcPr>
+          <w:p>
+            <w:r>
+              <w:t xml:space="preserve">The Run As user lacks permission on that object.</w:t>
+            </w:r>
+          </w:p>
+        </w:tc>
+      </w:tr>
+      <w:tr>
+        <w:tc>
+          <w:tcPr>
+            <w:tcW w:w="0" w:type="auto"/>
+            <w:tcBorders>
+              <w:top w:val="single" w:sz="6" w:space="0" w:color="auto"/>
+              <w:left w:val="single" w:sz="6" w:space="0" w:color="auto"/>
+              <w:bottom w:val="single" w:sz="6" w:space="0" w:color="auto"/>
+              <w:right w:val="single" w:sz="6" w:space="0" w:color="auto"/>
+            </w:tcBorders>
+            <w:tcMar>
+              <w:top w:w="105" w:type="dxa"/>
+              <w:left w:w="150" w:type="dxa"/>
+              <w:bottom w:w="105" w:type="dxa"/>
+              <w:right w:w="150" w:type="dxa"/>
+            </w:tcMar>
+          </w:tcPr>
+          <w:p>
+            <w:r>
+              <w:t xml:space="preserve">Nothing reaches Salesforce at all</w:t>
+            </w:r>
+          </w:p>
+        </w:tc>
+        <w:tc>
+          <w:tcPr>
+            <w:tcW w:w="0" w:type="auto"/>
+            <w:tcBorders>
+              <w:top w:val="single" w:sz="6" w:space="0" w:color="auto"/>
+              <w:left w:val="single" w:sz="6" w:space="0" w:color="auto"/>
+              <w:bottom w:val="single" w:sz="6" w:space="0" w:color="auto"/>
+              <w:right w:val="single" w:sz="6" w:space="0" w:color="auto"/>
+            </w:tcBorders>
+            <w:tcMar>
+              <w:top w:w="105" w:type="dxa"/>
+              <w:left w:w="150" w:type="dxa"/>
+              <w:bottom w:w="105" w:type="dxa"/>
+              <w:right w:w="150" w:type="dxa"/>
+            </w:tcMar>
+          </w:tcPr>
+          <w:p>
+            <w:r>
+              <w:t xml:space="preserve">A firewall is blocking it, or proxy settings are missing for the job account.</w:t>
+            </w:r>
+          </w:p>
+        </w:tc>
+      </w:tr>
+      <w:tr>
+        <w:tc>
+          <w:tcPr>
+            <w:tcW w:w="0" w:type="auto"/>
+            <w:tcBorders>
+              <w:top w:val="single" w:sz="6" w:space="0" w:color="auto"/>
+              <w:left w:val="single" w:sz="6" w:space="0" w:color="auto"/>
+              <w:bottom w:val="single" w:sz="6" w:space="0" w:color="auto"/>
+              <w:right w:val="single" w:sz="6" w:space="0" w:color="auto"/>
+            </w:tcBorders>
+            <w:tcMar>
+              <w:top w:w="105" w:type="dxa"/>
+              <w:left w:w="150" w:type="dxa"/>
+              <w:bottom w:w="105" w:type="dxa"/>
+              <w:right w:w="150" w:type="dxa"/>
+            </w:tcMar>
+          </w:tcPr>
+          <w:p>
+            <w:r>
+              <w:t xml:space="preserve">One of the seven commands not found</w:t>
+            </w:r>
+          </w:p>
+        </w:tc>
+        <w:tc>
+          <w:tcPr>
+            <w:tcW w:w="0" w:type="auto"/>
+            <w:tcBorders>
+              <w:top w:val="single" w:sz="6" w:space="0" w:color="auto"/>
+              <w:left w:val="single" w:sz="6" w:space="0" w:color="auto"/>
+              <w:bottom w:val="single" w:sz="6" w:space="0" w:color="auto"/>
+              <w:right w:val="single" w:sz="6" w:space="0" w:color="auto"/>
+            </w:tcBorders>
+            <w:tcMar>
+              <w:top w:w="105" w:type="dxa"/>
+              <w:left w:w="150" w:type="dxa"/>
+              <w:bottom w:w="105" w:type="dxa"/>
+              <w:right w:w="150" w:type="dxa"/>
+            </w:tcMar>
+          </w:tcPr>
+          <w:p>
+            <w:r>
+              <w:t xml:space="preserve">The CLI is too old. Update it and repeat Part 2 Step 3.</w:t>
+            </w:r>
+          </w:p>
+        </w:tc>
+      </w:tr>
+      <w:tr>
+        <w:tc>
+          <w:tcPr>
+            <w:tcW w:w="0" w:type="auto"/>
+            <w:tcBorders>
+              <w:top w:val="single" w:sz="6" w:space="0" w:color="auto"/>
+              <w:left w:val="single" w:sz="6" w:space="0" w:color="auto"/>
+              <w:bottom w:val="single" w:sz="6" w:space="0" w:color="auto"/>
+              <w:right w:val="single" w:sz="6" w:space="0" w:color="auto"/>
+            </w:tcBorders>
+            <w:tcMar>
+              <w:top w:w="105" w:type="dxa"/>
+              <w:left w:w="150" w:type="dxa"/>
+              <w:bottom w:w="105" w:type="dxa"/>
+              <w:right w:w="150" w:type="dxa"/>
+            </w:tcMar>
+          </w:tcPr>
+          <w:p>
+            <w:r>
+              <w:t xml:space="preserve">Worked before, now refused</w:t>
+            </w:r>
+          </w:p>
+        </w:tc>
+        <w:tc>
+          <w:tcPr>
+            <w:tcW w:w="0" w:type="auto"/>
+            <w:tcBorders>
+              <w:top w:val="single" w:sz="6" w:space="0" w:color="auto"/>
+              <w:left w:val="single" w:sz="6" w:space="0" w:color="auto"/>
+              <w:bottom w:val="single" w:sz="6" w:space="0" w:color="auto"/>
+              <w:right w:val="single" w:sz="6" w:space="0" w:color="auto"/>
+            </w:tcBorders>
+            <w:tcMar>
+              <w:top w:w="105" w:type="dxa"/>
+              <w:left w:w="150" w:type="dxa"/>
+              <w:bottom w:w="105" w:type="dxa"/>
+              <w:right w:w="150" w:type="dxa"/>
+            </w:tcMar>
+          </w:tcPr>
+          <w:p>
+            <w:r>
+              <w:t xml:space="preserve">The Client Secret may have been regenerated in Salesforce. Copy the new one into the file.</w:t>
+            </w:r>
+          </w:p>
+        </w:tc>
+      </w:tr>
+    </w:tbl>
     <w:sectPr>
       <w:pgSz w:w="12240" w:h="15840"/>
       <w:pgMar w:top="1440" w:right="1440" w:bottom="1440" w:left="1440" w:header="720" w:footer="720" w:gutter="0"/>

</xml_diff>